<commit_message>
Edited the Master_template File for Reporting
</commit_message>
<xml_diff>
--- a/Master_Template.docx
+++ b/Master_Template.docx
@@ -2550,7 +2550,7 @@
       </w:tr>
       <w:tr>
         <w:trPr>
-          <w:trHeight w:val="639"/>
+          <w:trHeight w:val="355"/>
         </w:trPr>
         <w:tc>
           <w:tcPr>
@@ -2571,7 +2571,7 @@
                 <w:spacing w:val="-2"/>
                 <w:sz w:val="24"/>
               </w:rPr>
-              <w:t xml:space="preserve">{% tr for item in OUTLINE %} </w:t>
+              <w:t>{% tr for item in OUTLINE %}</w:t>
             </w:r>
           </w:p>
           <w:p>
@@ -2586,34 +2586,16 @@
             <w:proofErr w:type="gramStart"/>
             <w:r>
               <w:rPr>
-                <w:spacing w:val="-2"/>
-                <w:sz w:val="24"/>
-              </w:rPr>
-              <w:t xml:space="preserve">{{ </w:t>
-            </w:r>
-            <w:proofErr w:type="spellStart"/>
-            <w:r>
-              <w:rPr>
-                <w:spacing w:val="-2"/>
-                <w:sz w:val="24"/>
-              </w:rPr>
-              <w:t>item</w:t>
+                <w:sz w:val="24"/>
+              </w:rPr>
+              <w:t>{{ item</w:t>
             </w:r>
             <w:proofErr w:type="gramEnd"/>
             <w:r>
               <w:rPr>
-                <w:spacing w:val="-2"/>
-                <w:sz w:val="24"/>
-              </w:rPr>
-              <w:t>.topic</w:t>
-            </w:r>
-            <w:proofErr w:type="spellEnd"/>
-            <w:r>
-              <w:rPr>
-                <w:spacing w:val="-2"/>
-                <w:sz w:val="24"/>
-              </w:rPr>
-              <w:t xml:space="preserve"> }}</w:t>
+                <w:sz w:val="24"/>
+              </w:rPr>
+              <w:t>.topic }}</w:t>
             </w:r>
           </w:p>
         </w:tc>
@@ -2642,31 +2624,15 @@
                 <w:spacing w:val="-2"/>
                 <w:sz w:val="24"/>
               </w:rPr>
-              <w:t xml:space="preserve">{{ </w:t>
-            </w:r>
-            <w:proofErr w:type="spellStart"/>
+              <w:t>{{ item</w:t>
+            </w:r>
+            <w:proofErr w:type="gramEnd"/>
             <w:r>
               <w:rPr>
                 <w:spacing w:val="-2"/>
                 <w:sz w:val="24"/>
               </w:rPr>
-              <w:t>item</w:t>
-            </w:r>
-            <w:proofErr w:type="gramEnd"/>
-            <w:r>
-              <w:rPr>
-                <w:spacing w:val="-2"/>
-                <w:sz w:val="24"/>
-              </w:rPr>
-              <w:t>.subtopic</w:t>
-            </w:r>
-            <w:proofErr w:type="spellEnd"/>
-            <w:r>
-              <w:rPr>
-                <w:spacing w:val="-2"/>
-                <w:sz w:val="24"/>
-              </w:rPr>
-              <w:t xml:space="preserve"> }}</w:t>
+              <w:t>.subtopic }}</w:t>
             </w:r>
           </w:p>
         </w:tc>
@@ -2688,14 +2654,7 @@
               <w:rPr>
                 <w:sz w:val="24"/>
               </w:rPr>
-              <w:t xml:space="preserve">{{ </w:t>
-            </w:r>
-            <w:proofErr w:type="spellStart"/>
-            <w:r>
-              <w:rPr>
-                <w:sz w:val="24"/>
-              </w:rPr>
-              <w:t>item</w:t>
+              <w:t>{{ item</w:t>
             </w:r>
             <w:proofErr w:type="gramEnd"/>
             <w:r>
@@ -2709,21 +2668,14 @@
               <w:rPr>
                 <w:sz w:val="24"/>
               </w:rPr>
-              <w:t>activity</w:t>
-            </w:r>
-            <w:proofErr w:type="spellEnd"/>
-            <w:r>
-              <w:rPr>
-                <w:sz w:val="24"/>
-              </w:rPr>
-              <w:t xml:space="preserve"> }</w:t>
+              <w:t>activity }</w:t>
             </w:r>
             <w:proofErr w:type="gramEnd"/>
             <w:r>
               <w:rPr>
                 <w:sz w:val="24"/>
               </w:rPr>
-              <w:t xml:space="preserve">} </w:t>
+              <w:t>}</w:t>
             </w:r>
           </w:p>
           <w:p>
@@ -2739,21 +2691,7 @@
               <w:rPr>
                 <w:sz w:val="24"/>
               </w:rPr>
-              <w:t xml:space="preserve">{% tr </w:t>
-            </w:r>
-            <w:proofErr w:type="spellStart"/>
-            <w:r>
-              <w:rPr>
-                <w:sz w:val="24"/>
-              </w:rPr>
-              <w:t>endfor</w:t>
-            </w:r>
-            <w:proofErr w:type="spellEnd"/>
-            <w:r>
-              <w:rPr>
-                <w:sz w:val="24"/>
-              </w:rPr>
-              <w:t xml:space="preserve"> %}</w:t>
+              <w:t>{% tr endfor %}</w:t>
             </w:r>
           </w:p>
         </w:tc>
@@ -2816,7 +2754,6 @@
       <w:r>
         <w:t xml:space="preserve">{{ </w:t>
       </w:r>
-      <w:proofErr w:type="spellStart"/>
       <w:r>
         <w:rPr>
           <w:b w:val="0"/>
@@ -2840,7 +2777,6 @@
         </w:rPr>
         <w:t>objectives</w:t>
       </w:r>
-      <w:proofErr w:type="spellEnd"/>
       <w:r>
         <w:t xml:space="preserve"> }</w:t>
       </w:r>
@@ -2887,7 +2823,6 @@
       <w:r>
         <w:t xml:space="preserve">{{ </w:t>
       </w:r>
-      <w:proofErr w:type="spellStart"/>
       <w:r>
         <w:rPr>
           <w:b w:val="0"/>
@@ -2918,7 +2853,6 @@
         </w:rPr>
         <w:t>utcomes</w:t>
       </w:r>
-      <w:proofErr w:type="spellEnd"/>
       <w:r>
         <w:t xml:space="preserve"> }</w:t>
       </w:r>
@@ -2965,7 +2899,6 @@
         </w:rPr>
         <w:t xml:space="preserve">{{ </w:t>
       </w:r>
-      <w:proofErr w:type="spellStart"/>
       <w:r>
         <w:rPr>
           <w:b w:val="0"/>
@@ -2987,15 +2920,7 @@
           <w:b w:val="0"/>
           <w:bCs w:val="0"/>
         </w:rPr>
-        <w:t>skills</w:t>
-      </w:r>
-      <w:proofErr w:type="spellEnd"/>
-      <w:r>
-        <w:rPr>
-          <w:b w:val="0"/>
-          <w:bCs w:val="0"/>
-        </w:rPr>
-        <w:t xml:space="preserve"> </w:t>
+        <w:t xml:space="preserve">skills </w:t>
       </w:r>
       <w:r>
         <w:rPr>
@@ -3041,7 +2966,6 @@
       <w:r>
         <w:t xml:space="preserve">{{ </w:t>
       </w:r>
-      <w:proofErr w:type="spellStart"/>
       <w:r>
         <w:t>knowledge</w:t>
       </w:r>
@@ -3053,7 +2977,6 @@
       <w:r>
         <w:t>gained</w:t>
       </w:r>
-      <w:proofErr w:type="spellEnd"/>
       <w:r>
         <w:t xml:space="preserve"> }</w:t>
       </w:r>
@@ -3093,7 +3016,6 @@
       <w:r>
         <w:t xml:space="preserve">{{ </w:t>
       </w:r>
-      <w:proofErr w:type="spellStart"/>
       <w:r>
         <w:t>compentencies</w:t>
       </w:r>
@@ -3105,7 +3027,6 @@
       <w:r>
         <w:t>achieved</w:t>
       </w:r>
-      <w:proofErr w:type="spellEnd"/>
       <w:r>
         <w:t xml:space="preserve"> }</w:t>
       </w:r>
@@ -3357,7 +3278,6 @@
               </w:rPr>
               <w:t xml:space="preserve">{{ </w:t>
             </w:r>
-            <w:proofErr w:type="spellStart"/>
             <w:r>
               <w:rPr>
                 <w:bCs/>
@@ -3371,7 +3291,6 @@
               </w:rPr>
               <w:t>_level</w:t>
             </w:r>
-            <w:proofErr w:type="spellEnd"/>
             <w:r>
               <w:rPr>
                 <w:b/>
@@ -3433,7 +3352,6 @@
               </w:rPr>
               <w:t xml:space="preserve">{{ </w:t>
             </w:r>
-            <w:proofErr w:type="spellStart"/>
             <w:r>
               <w:rPr>
                 <w:bCs/>
@@ -3453,7 +3371,6 @@
               </w:rPr>
               <w:t>feedback</w:t>
             </w:r>
-            <w:proofErr w:type="spellEnd"/>
             <w:r>
               <w:rPr>
                 <w:b/>
@@ -3734,7 +3651,6 @@
               </w:rPr>
               <w:t xml:space="preserve">{{ </w:t>
             </w:r>
-            <w:proofErr w:type="spellStart"/>
             <w:r>
               <w:rPr>
                 <w:bCs/>
@@ -3748,7 +3664,6 @@
               </w:rPr>
               <w:t>_quality</w:t>
             </w:r>
-            <w:proofErr w:type="spellEnd"/>
             <w:r>
               <w:rPr>
                 <w:b/>
@@ -3817,7 +3732,6 @@
               </w:rPr>
               <w:t xml:space="preserve">{{ </w:t>
             </w:r>
-            <w:proofErr w:type="spellStart"/>
             <w:r>
               <w:rPr>
                 <w:bCs/>
@@ -3837,7 +3751,6 @@
               </w:rPr>
               <w:t>effectiveness</w:t>
             </w:r>
-            <w:proofErr w:type="spellEnd"/>
             <w:r>
               <w:rPr>
                 <w:b/>
@@ -3918,7 +3831,6 @@
               </w:rPr>
               <w:t xml:space="preserve">{{ </w:t>
             </w:r>
-            <w:proofErr w:type="spellStart"/>
             <w:r>
               <w:rPr>
                 <w:bCs/>
@@ -3932,7 +3844,6 @@
               </w:rPr>
               <w:t>_resources</w:t>
             </w:r>
-            <w:proofErr w:type="spellEnd"/>
             <w:r>
               <w:rPr>
                 <w:b/>
@@ -4000,7 +3911,6 @@
               </w:rPr>
               <w:t xml:space="preserve">{{ </w:t>
             </w:r>
-            <w:proofErr w:type="spellStart"/>
             <w:r>
               <w:rPr>
                 <w:bCs/>
@@ -4020,7 +3930,6 @@
               </w:rPr>
               <w:t>support</w:t>
             </w:r>
-            <w:proofErr w:type="spellEnd"/>
             <w:r>
               <w:rPr>
                 <w:b/>
@@ -4082,7 +3991,6 @@
               </w:rPr>
               <w:t xml:space="preserve">{{ </w:t>
             </w:r>
-            <w:proofErr w:type="spellStart"/>
             <w:r>
               <w:rPr>
                 <w:bCs/>
@@ -4096,7 +4004,6 @@
               </w:rPr>
               <w:t>_arrangements</w:t>
             </w:r>
-            <w:proofErr w:type="spellEnd"/>
             <w:r>
               <w:rPr>
                 <w:b/>
@@ -10074,7 +9981,6 @@
   <w:style w:type="character" w:default="1" w:styleId="DefaultParagraphFont">
     <w:name w:val="Default Paragraph Font"/>
     <w:uiPriority w:val="1"/>
-    <w:semiHidden/>
     <w:unhideWhenUsed/>
   </w:style>
   <w:style w:type="table" w:default="1" w:styleId="TableNormal">

</xml_diff>

<commit_message>
Edited the app.py and Master_Template.docx file
</commit_message>
<xml_diff>
--- a/Master_Template.docx
+++ b/Master_Template.docx
@@ -102,8 +102,21 @@
         </w:rPr>
         <w:br/>
       </w:r>
-      <w:r>
-        <w:t>{{ WEEK_NUMBER }}</w:t>
+      <w:proofErr w:type="gramStart"/>
+      <w:r>
+        <w:t>{{ WEEK</w:t>
+      </w:r>
+      <w:proofErr w:type="gramEnd"/>
+      <w:r>
+        <w:t>_</w:t>
+      </w:r>
+      <w:proofErr w:type="gramStart"/>
+      <w:r>
+        <w:t>NUMBER }</w:t>
+      </w:r>
+      <w:proofErr w:type="gramEnd"/>
+      <w:r>
+        <w:t>}</w:t>
       </w:r>
     </w:p>
     <w:p>
@@ -905,6 +918,7 @@
                 <w:sz w:val="24"/>
               </w:rPr>
             </w:pPr>
+            <w:proofErr w:type="gramStart"/>
             <w:r>
               <w:rPr>
                 <w:sz w:val="24"/>
@@ -917,6 +931,7 @@
               </w:rPr>
               <w:t>ING</w:t>
             </w:r>
+            <w:proofErr w:type="gramEnd"/>
             <w:r>
               <w:rPr>
                 <w:sz w:val="24"/>
@@ -990,6 +1005,7 @@
               </w:rPr>
               <w:t xml:space="preserve"> </w:t>
             </w:r>
+            <w:proofErr w:type="gramStart"/>
             <w:r>
               <w:rPr>
                 <w:spacing w:val="-2"/>
@@ -1009,7 +1025,16 @@
                 <w:bCs/>
                 <w:iCs/>
               </w:rPr>
-              <w:t>SECOND_ADMIN</w:t>
+              <w:t>SECOND</w:t>
+            </w:r>
+            <w:proofErr w:type="gramEnd"/>
+            <w:r>
+              <w:rPr>
+                <w:b/>
+                <w:bCs/>
+                <w:iCs/>
+              </w:rPr>
+              <w:t>_ADMIN</w:t>
             </w:r>
             <w:r>
               <w:rPr>
@@ -1072,6 +1097,7 @@
                 <w:sz w:val="24"/>
               </w:rPr>
             </w:pPr>
+            <w:proofErr w:type="gramStart"/>
             <w:r>
               <w:rPr>
                 <w:spacing w:val="-2"/>
@@ -1086,6 +1112,7 @@
               </w:rPr>
               <w:t>SUBMISSION</w:t>
             </w:r>
+            <w:proofErr w:type="gramEnd"/>
             <w:r>
               <w:rPr>
                 <w:spacing w:val="-2"/>
@@ -1137,20 +1164,30 @@
               <w:pStyle w:val="BodyText"/>
               <w:spacing w:before="201"/>
             </w:pPr>
+            <w:proofErr w:type="gramStart"/>
             <w:r>
               <w:t xml:space="preserve">{{ </w:t>
             </w:r>
             <w:r>
               <w:t>MODULE</w:t>
             </w:r>
-            <w:r>
-              <w:t>_N</w:t>
+            <w:proofErr w:type="gramEnd"/>
+            <w:r>
+              <w:t>_</w:t>
+            </w:r>
+            <w:proofErr w:type="gramStart"/>
+            <w:r>
+              <w:t>N</w:t>
             </w:r>
             <w:r>
               <w:t>UMBER</w:t>
             </w:r>
             <w:r>
-              <w:t xml:space="preserve"> }}</w:t>
+              <w:t xml:space="preserve"> }</w:t>
+            </w:r>
+            <w:proofErr w:type="gramEnd"/>
+            <w:r>
+              <w:t>}</w:t>
             </w:r>
             <w:r>
               <w:t>:</w:t>
@@ -1161,12 +1198,14 @@
               </w:rPr>
               <w:t xml:space="preserve"> </w:t>
             </w:r>
+            <w:proofErr w:type="gramStart"/>
             <w:r>
               <w:t xml:space="preserve">{{ </w:t>
             </w:r>
             <w:r>
               <w:t>MODULE</w:t>
             </w:r>
+            <w:proofErr w:type="gramEnd"/>
             <w:r>
               <w:t>_</w:t>
             </w:r>
@@ -1291,11 +1330,33 @@
         </w:rPr>
         <w:t xml:space="preserve"> </w:t>
       </w:r>
-      <w:r>
-        <w:rPr>
-          <w:sz w:val="24"/>
-        </w:rPr>
-        <w:t>{{ TRAINER_NAME }}</w:t>
+      <w:proofErr w:type="gramStart"/>
+      <w:r>
+        <w:rPr>
+          <w:sz w:val="24"/>
+        </w:rPr>
+        <w:t>{{ TRAINER</w:t>
+      </w:r>
+      <w:proofErr w:type="gramEnd"/>
+      <w:r>
+        <w:rPr>
+          <w:sz w:val="24"/>
+        </w:rPr>
+        <w:t>_</w:t>
+      </w:r>
+      <w:proofErr w:type="gramStart"/>
+      <w:r>
+        <w:rPr>
+          <w:sz w:val="24"/>
+        </w:rPr>
+        <w:t>NAME }</w:t>
+      </w:r>
+      <w:proofErr w:type="gramEnd"/>
+      <w:r>
+        <w:rPr>
+          <w:sz w:val="24"/>
+        </w:rPr>
+        <w:t>}</w:t>
       </w:r>
       <w:r>
         <w:rPr>
@@ -1319,6 +1380,7 @@
         </w:rPr>
         <w:t xml:space="preserve">Session Date &amp; Time: </w:t>
       </w:r>
+      <w:proofErr w:type="gramStart"/>
       <w:r>
         <w:rPr>
           <w:sz w:val="24"/>
@@ -1331,12 +1393,14 @@
         </w:rPr>
         <w:t>EPORTING</w:t>
       </w:r>
+      <w:proofErr w:type="gramEnd"/>
       <w:r>
         <w:rPr>
           <w:sz w:val="24"/>
         </w:rPr>
         <w:t>_</w:t>
       </w:r>
+      <w:proofErr w:type="gramStart"/>
       <w:r>
         <w:rPr>
           <w:sz w:val="24"/>
@@ -1347,7 +1411,14 @@
         <w:rPr>
           <w:sz w:val="24"/>
         </w:rPr>
-        <w:t xml:space="preserve"> }}</w:t>
+        <w:t xml:space="preserve"> }</w:t>
+      </w:r>
+      <w:proofErr w:type="gramEnd"/>
+      <w:r>
+        <w:rPr>
+          <w:sz w:val="24"/>
+        </w:rPr>
+        <w:t>}</w:t>
       </w:r>
     </w:p>
     <w:p>
@@ -1685,20 +1756,30 @@
         <w:spacing w:before="201"/>
         <w:ind w:left="720"/>
       </w:pPr>
+      <w:proofErr w:type="gramStart"/>
       <w:r>
         <w:t xml:space="preserve">{{ </w:t>
       </w:r>
       <w:r>
         <w:t>MODULE</w:t>
       </w:r>
-      <w:r>
-        <w:t>_N</w:t>
+      <w:proofErr w:type="gramEnd"/>
+      <w:r>
+        <w:t>_</w:t>
+      </w:r>
+      <w:proofErr w:type="gramStart"/>
+      <w:r>
+        <w:t>N</w:t>
       </w:r>
       <w:r>
         <w:t>UMBER</w:t>
       </w:r>
       <w:r>
-        <w:t xml:space="preserve"> }}</w:t>
+        <w:t xml:space="preserve"> }</w:t>
+      </w:r>
+      <w:proofErr w:type="gramEnd"/>
+      <w:r>
+        <w:t>}</w:t>
       </w:r>
       <w:r>
         <w:t xml:space="preserve"> </w:t>
@@ -1911,6 +1992,12 @@
       </w:r>
       <w:r>
         <w:rPr>
+          <w:spacing w:val="-1"/>
+        </w:rPr>
+        <w:t xml:space="preserve">the </w:t>
+      </w:r>
+      <w:r>
+        <w:rPr>
           <w:spacing w:val="-2"/>
         </w:rPr>
         <w:t>Module</w:t>
@@ -1922,8 +2009,13 @@
         <w:spacing w:before="202"/>
         <w:ind w:left="720" w:right="1423"/>
       </w:pPr>
-      <w:r>
-        <w:t>{{ benefits }}</w:t>
+      <w:proofErr w:type="gramStart"/>
+      <w:r>
+        <w:t>{{ benefits</w:t>
+      </w:r>
+      <w:proofErr w:type="gramEnd"/>
+      <w:r>
+        <w:t xml:space="preserve"> }}</w:t>
       </w:r>
     </w:p>
     <w:p>
@@ -2095,6 +2187,7 @@
         </w:rPr>
         <w:t xml:space="preserve"> </w:t>
       </w:r>
+      <w:proofErr w:type="gramStart"/>
       <w:r>
         <w:rPr>
           <w:b w:val="0"/>
@@ -2109,6 +2202,7 @@
         </w:rPr>
         <w:t>MODULE</w:t>
       </w:r>
+      <w:proofErr w:type="gramEnd"/>
       <w:r>
         <w:rPr>
           <w:b w:val="0"/>
@@ -2116,6 +2210,7 @@
         </w:rPr>
         <w:t>_</w:t>
       </w:r>
+      <w:proofErr w:type="gramStart"/>
       <w:r>
         <w:rPr>
           <w:b w:val="0"/>
@@ -2128,7 +2223,15 @@
           <w:b w:val="0"/>
           <w:spacing w:val="-10"/>
         </w:rPr>
-        <w:t xml:space="preserve"> }}</w:t>
+        <w:t xml:space="preserve"> }</w:t>
+      </w:r>
+      <w:proofErr w:type="gramEnd"/>
+      <w:r>
+        <w:rPr>
+          <w:b w:val="0"/>
+          <w:spacing w:val="-10"/>
+        </w:rPr>
+        <w:t>}</w:t>
       </w:r>
     </w:p>
     <w:p>
@@ -2169,6 +2272,7 @@
         </w:rPr>
         <w:t xml:space="preserve"> </w:t>
       </w:r>
+      <w:proofErr w:type="gramStart"/>
       <w:r>
         <w:rPr>
           <w:sz w:val="24"/>
@@ -2181,12 +2285,14 @@
         </w:rPr>
         <w:t>MODULE</w:t>
       </w:r>
+      <w:proofErr w:type="gramEnd"/>
       <w:r>
         <w:rPr>
           <w:sz w:val="24"/>
         </w:rPr>
         <w:t>_</w:t>
       </w:r>
+      <w:proofErr w:type="gramStart"/>
       <w:r>
         <w:rPr>
           <w:sz w:val="24"/>
@@ -2197,7 +2303,14 @@
         <w:rPr>
           <w:sz w:val="24"/>
         </w:rPr>
-        <w:t xml:space="preserve"> }}</w:t>
+        <w:t xml:space="preserve"> }</w:t>
+      </w:r>
+      <w:proofErr w:type="gramEnd"/>
+      <w:r>
+        <w:rPr>
+          <w:sz w:val="24"/>
+        </w:rPr>
+        <w:t>}</w:t>
       </w:r>
     </w:p>
     <w:p>
@@ -2329,215 +2442,68 @@
     </w:p>
     <w:p>
       <w:pPr>
-        <w:pStyle w:val="BodyText"/>
-        <w:spacing w:before="4"/>
-        <w:rPr>
-          <w:sz w:val="17"/>
-        </w:rPr>
-      </w:pPr>
-    </w:p>
-    <w:tbl>
-      <w:tblPr>
-        <w:tblW w:w="0" w:type="auto"/>
-        <w:tblInd w:w="159" w:type="dxa"/>
-        <w:tblBorders>
-          <w:top w:val="single" w:sz="8" w:space="0" w:color="000000"/>
-          <w:left w:val="single" w:sz="8" w:space="0" w:color="000000"/>
-          <w:bottom w:val="single" w:sz="8" w:space="0" w:color="000000"/>
-          <w:right w:val="single" w:sz="8" w:space="0" w:color="000000"/>
-          <w:insideH w:val="single" w:sz="8" w:space="0" w:color="000000"/>
-          <w:insideV w:val="single" w:sz="8" w:space="0" w:color="000000"/>
-        </w:tblBorders>
-        <w:tblLayout w:type="fixed"/>
-        <w:tblCellMar>
-          <w:left w:w="0" w:type="dxa"/>
-          <w:right w:w="0" w:type="dxa"/>
-        </w:tblCellMar>
-        <w:tblLook w:val="01E0" w:firstRow="1" w:lastRow="1" w:firstColumn="1" w:lastColumn="1" w:noHBand="0" w:noVBand="0"/>
-      </w:tblPr>
-      <w:tblGrid>
-        <w:gridCol w:w="3503"/>
-        <w:gridCol w:w="3500"/>
-        <w:gridCol w:w="3500"/>
-      </w:tblGrid>
-      <w:tr>
-        <w:trPr>
-          <w:trHeight w:val="476"/>
-        </w:trPr>
-        <w:tc>
-          <w:tcPr>
-            <w:tcW w:w="3503" w:type="dxa"/>
-          </w:tcPr>
-          <w:p>
-            <w:pPr>
-              <w:pStyle w:val="TableParagraph"/>
-              <w:spacing w:line="275" w:lineRule="exact"/>
-              <w:ind w:left="107"/>
-              <w:rPr>
-                <w:sz w:val="24"/>
-              </w:rPr>
-            </w:pPr>
-            <w:r>
-              <w:rPr>
-                <w:spacing w:val="-2"/>
-                <w:sz w:val="24"/>
-              </w:rPr>
-              <w:t>Topic</w:t>
-            </w:r>
-          </w:p>
-        </w:tc>
-        <w:tc>
-          <w:tcPr>
-            <w:tcW w:w="3500" w:type="dxa"/>
-          </w:tcPr>
-          <w:p>
-            <w:pPr>
-              <w:pStyle w:val="TableParagraph"/>
-              <w:spacing w:line="275" w:lineRule="exact"/>
-              <w:ind w:left="107"/>
-              <w:rPr>
-                <w:sz w:val="24"/>
-              </w:rPr>
-            </w:pPr>
-            <w:r>
-              <w:rPr>
-                <w:spacing w:val="-2"/>
-                <w:sz w:val="24"/>
-              </w:rPr>
-              <w:t>Sub-topics</w:t>
-            </w:r>
-          </w:p>
-        </w:tc>
-        <w:tc>
-          <w:tcPr>
-            <w:tcW w:w="3500" w:type="dxa"/>
-          </w:tcPr>
-          <w:p>
-            <w:pPr>
-              <w:pStyle w:val="TableParagraph"/>
-              <w:spacing w:line="275" w:lineRule="exact"/>
-              <w:ind w:left="106"/>
-              <w:rPr>
-                <w:sz w:val="24"/>
-              </w:rPr>
-            </w:pPr>
-            <w:r>
-              <w:rPr>
-                <w:spacing w:val="-2"/>
-                <w:sz w:val="24"/>
-              </w:rPr>
-              <w:t>Activities</w:t>
-            </w:r>
-          </w:p>
-        </w:tc>
-      </w:tr>
-      <w:tr>
-        <w:trPr>
-          <w:trHeight w:val="355"/>
-        </w:trPr>
-        <w:tc>
-          <w:tcPr>
-            <w:tcW w:w="3503" w:type="dxa"/>
-          </w:tcPr>
-          <w:p>
-            <w:pPr>
-              <w:pStyle w:val="TableParagraph"/>
-              <w:spacing w:line="275" w:lineRule="exact"/>
-              <w:ind w:left="0"/>
-              <w:rPr>
-                <w:spacing w:val="-2"/>
-                <w:sz w:val="24"/>
-              </w:rPr>
-            </w:pPr>
-            <w:r>
-              <w:rPr>
-                <w:spacing w:val="-2"/>
-                <w:sz w:val="24"/>
-              </w:rPr>
-              <w:t>{% tr for item in OUTLINE %}</w:t>
-            </w:r>
-          </w:p>
-          <w:p>
-            <w:pPr>
-              <w:pStyle w:val="TableParagraph"/>
-              <w:spacing w:line="275" w:lineRule="exact"/>
-              <w:ind w:left="0"/>
-              <w:rPr>
-                <w:spacing w:val="-2"/>
-                <w:sz w:val="24"/>
-              </w:rPr>
-            </w:pPr>
-            <w:r>
-              <w:rPr>
-                <w:spacing w:val="-2"/>
-                <w:sz w:val="24"/>
-              </w:rPr>
-              <w:t>{{ item.topic }}</w:t>
-            </w:r>
-          </w:p>
-        </w:tc>
-        <w:tc>
-          <w:tcPr>
-            <w:tcW w:w="3500" w:type="dxa"/>
-          </w:tcPr>
-          <w:p>
-            <w:pPr>
-              <w:pStyle w:val="TableParagraph"/>
-              <w:tabs>
-                <w:tab w:val="left" w:pos="827"/>
-              </w:tabs>
-              <w:ind w:left="0" w:right="273"/>
-              <w:rPr>
-                <w:sz w:val="24"/>
-              </w:rPr>
-            </w:pPr>
-            <w:r>
-              <w:rPr>
-                <w:sz w:val="24"/>
-              </w:rPr>
-              <w:t>{{ item.subtopic }}</w:t>
-            </w:r>
-          </w:p>
-        </w:tc>
-        <w:tc>
-          <w:tcPr>
-            <w:tcW w:w="3500" w:type="dxa"/>
-          </w:tcPr>
-          <w:p>
-            <w:pPr>
-              <w:pStyle w:val="TableParagraph"/>
-              <w:spacing w:line="275" w:lineRule="exact"/>
-              <w:ind w:left="0"/>
-              <w:rPr>
-                <w:sz w:val="24"/>
-              </w:rPr>
-            </w:pPr>
-            <w:r>
-              <w:rPr>
-                <w:sz w:val="24"/>
-              </w:rPr>
-              <w:t>{{ item.activity }}</w:t>
-            </w:r>
-          </w:p>
-          <w:p>
-            <w:pPr>
-              <w:pStyle w:val="TableParagraph"/>
-              <w:spacing w:line="275" w:lineRule="exact"/>
-              <w:ind w:left="0"/>
-              <w:rPr>
-                <w:sz w:val="24"/>
-              </w:rPr>
-            </w:pPr>
-            <w:r>
-              <w:rPr>
-                <w:sz w:val="24"/>
-              </w:rPr>
-              <w:t>{% tr endfor %}</w:t>
-            </w:r>
-          </w:p>
-        </w:tc>
-      </w:tr>
-    </w:tbl>
+        <w:pStyle w:val="TableParagraph"/>
+        <w:spacing w:line="275" w:lineRule="exact"/>
+        <w:ind w:left="0"/>
+        <w:rPr>
+          <w:sz w:val="24"/>
+        </w:rPr>
+      </w:pPr>
+    </w:p>
+    <w:p>
+      <w:pPr>
+        <w:pStyle w:val="TableParagraph"/>
+        <w:spacing w:line="275" w:lineRule="exact"/>
+        <w:ind w:left="0"/>
+        <w:rPr>
+          <w:sz w:val="24"/>
+        </w:rPr>
+      </w:pPr>
+      <w:r>
+        <w:rPr>
+          <w:sz w:val="24"/>
+        </w:rPr>
+        <w:tab/>
+      </w:r>
+      <w:proofErr w:type="gramStart"/>
+      <w:r>
+        <w:rPr>
+          <w:sz w:val="24"/>
+        </w:rPr>
+        <w:t>{{ OUTLINE</w:t>
+      </w:r>
+      <w:proofErr w:type="gramEnd"/>
+      <w:r>
+        <w:rPr>
+          <w:sz w:val="24"/>
+        </w:rPr>
+        <w:t>_</w:t>
+      </w:r>
+      <w:proofErr w:type="gramStart"/>
+      <w:r>
+        <w:rPr>
+          <w:sz w:val="24"/>
+        </w:rPr>
+        <w:t>TABLE }</w:t>
+      </w:r>
+      <w:proofErr w:type="gramEnd"/>
+      <w:r>
+        <w:rPr>
+          <w:sz w:val="24"/>
+        </w:rPr>
+        <w:t>}</w:t>
+      </w:r>
+    </w:p>
+    <w:p>
+      <w:pPr>
+        <w:pStyle w:val="TableParagraph"/>
+        <w:spacing w:line="275" w:lineRule="exact"/>
+        <w:ind w:left="0"/>
+        <w:rPr>
+          <w:sz w:val="24"/>
+        </w:rPr>
+      </w:pPr>
+    </w:p>
     <w:p>
       <w:pPr>
         <w:pStyle w:val="TableParagraph"/>
@@ -2591,18 +2557,41 @@
         </w:tabs>
         <w:ind w:left="1080"/>
       </w:pPr>
+      <w:proofErr w:type="gramStart"/>
       <w:r>
         <w:t xml:space="preserve">{{ </w:t>
       </w:r>
+      <w:proofErr w:type="spellStart"/>
       <w:r>
         <w:rPr>
           <w:b w:val="0"/>
           <w:bCs w:val="0"/>
         </w:rPr>
-        <w:t>learning_objectives</w:t>
-      </w:r>
-      <w:r>
-        <w:t xml:space="preserve"> }}</w:t>
+        <w:t>learning</w:t>
+      </w:r>
+      <w:proofErr w:type="gramEnd"/>
+      <w:r>
+        <w:rPr>
+          <w:b w:val="0"/>
+          <w:bCs w:val="0"/>
+        </w:rPr>
+        <w:t>_</w:t>
+      </w:r>
+      <w:proofErr w:type="gramStart"/>
+      <w:r>
+        <w:rPr>
+          <w:b w:val="0"/>
+          <w:bCs w:val="0"/>
+        </w:rPr>
+        <w:t>objectives</w:t>
+      </w:r>
+      <w:proofErr w:type="spellEnd"/>
+      <w:r>
+        <w:t xml:space="preserve"> }</w:t>
+      </w:r>
+      <w:proofErr w:type="gramEnd"/>
+      <w:r>
+        <w:t>}</w:t>
       </w:r>
     </w:p>
     <w:p>
@@ -2639,25 +2628,48 @@
         <w:spacing w:before="201"/>
         <w:ind w:left="1080"/>
       </w:pPr>
+      <w:proofErr w:type="gramStart"/>
       <w:r>
         <w:t xml:space="preserve">{{ </w:t>
       </w:r>
+      <w:proofErr w:type="spellStart"/>
       <w:r>
         <w:rPr>
           <w:b w:val="0"/>
           <w:bCs w:val="0"/>
         </w:rPr>
-        <w:t>learning_o</w:t>
-      </w:r>
+        <w:t>learning</w:t>
+      </w:r>
+      <w:proofErr w:type="gramEnd"/>
       <w:r>
         <w:rPr>
           <w:b w:val="0"/>
           <w:bCs w:val="0"/>
         </w:rPr>
+        <w:t>_</w:t>
+      </w:r>
+      <w:proofErr w:type="gramStart"/>
+      <w:r>
+        <w:rPr>
+          <w:b w:val="0"/>
+          <w:bCs w:val="0"/>
+        </w:rPr>
+        <w:t>o</w:t>
+      </w:r>
+      <w:r>
+        <w:rPr>
+          <w:b w:val="0"/>
+          <w:bCs w:val="0"/>
+        </w:rPr>
         <w:t>utcomes</w:t>
       </w:r>
-      <w:r>
-        <w:t xml:space="preserve"> }}</w:t>
+      <w:proofErr w:type="spellEnd"/>
+      <w:r>
+        <w:t xml:space="preserve"> }</w:t>
+      </w:r>
+      <w:proofErr w:type="gramEnd"/>
+      <w:r>
+        <w:t>}</w:t>
       </w:r>
     </w:p>
     <w:p>
@@ -2690,6 +2702,7 @@
           <w:bCs w:val="0"/>
         </w:rPr>
       </w:pPr>
+      <w:proofErr w:type="gramStart"/>
       <w:r>
         <w:rPr>
           <w:b w:val="0"/>
@@ -2697,19 +2710,52 @@
         </w:rPr>
         <w:t xml:space="preserve">{{ </w:t>
       </w:r>
+      <w:proofErr w:type="spellStart"/>
       <w:r>
         <w:rPr>
           <w:b w:val="0"/>
           <w:bCs w:val="0"/>
         </w:rPr>
-        <w:t xml:space="preserve">demonstrated_skills </w:t>
-      </w:r>
+        <w:t>demonstrated</w:t>
+      </w:r>
+      <w:proofErr w:type="gramEnd"/>
       <w:r>
         <w:rPr>
           <w:b w:val="0"/>
           <w:bCs w:val="0"/>
         </w:rPr>
-        <w:t>}}</w:t>
+        <w:t>_</w:t>
+      </w:r>
+      <w:proofErr w:type="gramStart"/>
+      <w:r>
+        <w:rPr>
+          <w:b w:val="0"/>
+          <w:bCs w:val="0"/>
+        </w:rPr>
+        <w:t>skills</w:t>
+      </w:r>
+      <w:proofErr w:type="spellEnd"/>
+      <w:r>
+        <w:rPr>
+          <w:b w:val="0"/>
+          <w:bCs w:val="0"/>
+        </w:rPr>
+        <w:t xml:space="preserve"> </w:t>
+      </w:r>
+      <w:r>
+        <w:rPr>
+          <w:b w:val="0"/>
+          <w:bCs w:val="0"/>
+        </w:rPr>
+        <w:t>}</w:t>
+      </w:r>
+      <w:proofErr w:type="gramEnd"/>
+      <w:r>
+        <w:rPr>
+          <w:b w:val="0"/>
+          <w:bCs w:val="0"/>
+        </w:rPr>
+        <w:t>}</w:t>
       </w:r>
     </w:p>
     <w:p>
@@ -2736,14 +2782,29 @@
         <w:spacing w:before="201"/>
         <w:ind w:left="720"/>
       </w:pPr>
+      <w:proofErr w:type="gramStart"/>
       <w:r>
         <w:t xml:space="preserve">{{ </w:t>
       </w:r>
-      <w:r>
-        <w:t>knowledge_gained</w:t>
-      </w:r>
-      <w:r>
-        <w:t xml:space="preserve"> }}</w:t>
+      <w:proofErr w:type="spellStart"/>
+      <w:r>
+        <w:t>knowledge</w:t>
+      </w:r>
+      <w:proofErr w:type="gramEnd"/>
+      <w:r>
+        <w:t>_</w:t>
+      </w:r>
+      <w:proofErr w:type="gramStart"/>
+      <w:r>
+        <w:t>gained</w:t>
+      </w:r>
+      <w:proofErr w:type="spellEnd"/>
+      <w:r>
+        <w:t xml:space="preserve"> }</w:t>
+      </w:r>
+      <w:proofErr w:type="gramEnd"/>
+      <w:r>
+        <w:t>}</w:t>
       </w:r>
     </w:p>
     <w:p>
@@ -2773,14 +2834,29 @@
         <w:spacing w:before="201"/>
         <w:ind w:left="720"/>
       </w:pPr>
+      <w:proofErr w:type="gramStart"/>
       <w:r>
         <w:t xml:space="preserve">{{ </w:t>
       </w:r>
-      <w:r>
-        <w:t>compentencies_achieved</w:t>
-      </w:r>
-      <w:r>
-        <w:t xml:space="preserve"> }}</w:t>
+      <w:proofErr w:type="spellStart"/>
+      <w:r>
+        <w:t>compentencies</w:t>
+      </w:r>
+      <w:proofErr w:type="gramEnd"/>
+      <w:r>
+        <w:t>_</w:t>
+      </w:r>
+      <w:proofErr w:type="gramStart"/>
+      <w:r>
+        <w:t>achieved</w:t>
+      </w:r>
+      <w:proofErr w:type="spellEnd"/>
+      <w:r>
+        <w:t xml:space="preserve"> }</w:t>
+      </w:r>
+      <w:proofErr w:type="gramEnd"/>
+      <w:r>
+        <w:t>}</w:t>
       </w:r>
     </w:p>
     <w:p>
@@ -2945,6 +3021,7 @@
                 <w:sz w:val="24"/>
               </w:rPr>
             </w:pPr>
+            <w:proofErr w:type="gramStart"/>
             <w:r>
               <w:rPr>
                 <w:b/>
@@ -2957,6 +3034,7 @@
               </w:rPr>
               <w:t>attendance</w:t>
             </w:r>
+            <w:proofErr w:type="gramEnd"/>
             <w:r>
               <w:rPr>
                 <w:b/>
@@ -3017,18 +3095,28 @@
                 <w:sz w:val="24"/>
               </w:rPr>
             </w:pPr>
+            <w:proofErr w:type="gramStart"/>
             <w:r>
               <w:rPr>
                 <w:b/>
               </w:rPr>
               <w:t xml:space="preserve">{{ </w:t>
             </w:r>
+            <w:proofErr w:type="spellStart"/>
             <w:r>
               <w:rPr>
                 <w:bCs/>
               </w:rPr>
-              <w:t>engagement_level</w:t>
-            </w:r>
+              <w:t>engagement</w:t>
+            </w:r>
+            <w:proofErr w:type="gramEnd"/>
+            <w:r>
+              <w:rPr>
+                <w:bCs/>
+              </w:rPr>
+              <w:t>_level</w:t>
+            </w:r>
+            <w:proofErr w:type="spellEnd"/>
             <w:r>
               <w:rPr>
                 <w:b/>
@@ -3083,18 +3171,21 @@
                 <w:sz w:val="24"/>
               </w:rPr>
             </w:pPr>
+            <w:proofErr w:type="gramStart"/>
             <w:r>
               <w:rPr>
                 <w:b/>
               </w:rPr>
               <w:t xml:space="preserve">{{ </w:t>
             </w:r>
+            <w:proofErr w:type="spellStart"/>
             <w:r>
               <w:rPr>
                 <w:bCs/>
               </w:rPr>
               <w:t>participant</w:t>
             </w:r>
+            <w:proofErr w:type="gramEnd"/>
             <w:r>
               <w:rPr>
                 <w:bCs/>
@@ -3107,6 +3198,7 @@
               </w:rPr>
               <w:t>feedback</w:t>
             </w:r>
+            <w:proofErr w:type="spellEnd"/>
             <w:r>
               <w:rPr>
                 <w:b/>
@@ -3380,18 +3472,28 @@
                 <w:sz w:val="24"/>
               </w:rPr>
             </w:pPr>
+            <w:proofErr w:type="gramStart"/>
             <w:r>
               <w:rPr>
                 <w:b/>
               </w:rPr>
               <w:t xml:space="preserve">{{ </w:t>
             </w:r>
+            <w:proofErr w:type="spellStart"/>
             <w:r>
               <w:rPr>
                 <w:bCs/>
               </w:rPr>
-              <w:t>content_quality</w:t>
-            </w:r>
+              <w:t>content</w:t>
+            </w:r>
+            <w:proofErr w:type="gramEnd"/>
+            <w:r>
+              <w:rPr>
+                <w:bCs/>
+              </w:rPr>
+              <w:t>_quality</w:t>
+            </w:r>
+            <w:proofErr w:type="spellEnd"/>
             <w:r>
               <w:rPr>
                 <w:b/>
@@ -3453,18 +3555,21 @@
                 <w:sz w:val="24"/>
               </w:rPr>
             </w:pPr>
+            <w:proofErr w:type="gramStart"/>
             <w:r>
               <w:rPr>
                 <w:b/>
               </w:rPr>
               <w:t xml:space="preserve">{{ </w:t>
             </w:r>
+            <w:proofErr w:type="spellStart"/>
             <w:r>
               <w:rPr>
                 <w:bCs/>
               </w:rPr>
               <w:t>trainer</w:t>
             </w:r>
+            <w:proofErr w:type="gramEnd"/>
             <w:r>
               <w:rPr>
                 <w:bCs/>
@@ -3477,6 +3582,7 @@
               </w:rPr>
               <w:t>effectiveness</w:t>
             </w:r>
+            <w:proofErr w:type="spellEnd"/>
             <w:r>
               <w:rPr>
                 <w:b/>
@@ -3550,18 +3656,28 @@
                 <w:sz w:val="24"/>
               </w:rPr>
             </w:pPr>
+            <w:proofErr w:type="gramStart"/>
             <w:r>
               <w:rPr>
                 <w:b/>
               </w:rPr>
               <w:t xml:space="preserve">{{ </w:t>
             </w:r>
+            <w:proofErr w:type="spellStart"/>
             <w:r>
               <w:rPr>
                 <w:bCs/>
               </w:rPr>
-              <w:t>materials_resources</w:t>
-            </w:r>
+              <w:t>materials</w:t>
+            </w:r>
+            <w:proofErr w:type="gramEnd"/>
+            <w:r>
+              <w:rPr>
+                <w:bCs/>
+              </w:rPr>
+              <w:t>_resources</w:t>
+            </w:r>
+            <w:proofErr w:type="spellEnd"/>
             <w:r>
               <w:rPr>
                 <w:b/>
@@ -3622,18 +3738,21 @@
                 <w:sz w:val="24"/>
               </w:rPr>
             </w:pPr>
+            <w:proofErr w:type="gramStart"/>
             <w:r>
               <w:rPr>
                 <w:b/>
               </w:rPr>
               <w:t xml:space="preserve">{{ </w:t>
             </w:r>
+            <w:proofErr w:type="spellStart"/>
             <w:r>
               <w:rPr>
                 <w:bCs/>
               </w:rPr>
               <w:t>technical</w:t>
             </w:r>
+            <w:proofErr w:type="gramEnd"/>
             <w:r>
               <w:rPr>
                 <w:bCs/>
@@ -3646,6 +3765,7 @@
               </w:rPr>
               <w:t>support</w:t>
             </w:r>
+            <w:proofErr w:type="spellEnd"/>
             <w:r>
               <w:rPr>
                 <w:b/>
@@ -3700,18 +3820,28 @@
                 <w:sz w:val="24"/>
               </w:rPr>
             </w:pPr>
+            <w:proofErr w:type="gramStart"/>
             <w:r>
               <w:rPr>
                 <w:b/>
               </w:rPr>
               <w:t xml:space="preserve">{{ </w:t>
             </w:r>
+            <w:proofErr w:type="spellStart"/>
             <w:r>
               <w:rPr>
                 <w:bCs/>
               </w:rPr>
-              <w:t>logistical_arrangements</w:t>
-            </w:r>
+              <w:t>logistical</w:t>
+            </w:r>
+            <w:proofErr w:type="gramEnd"/>
+            <w:r>
+              <w:rPr>
+                <w:bCs/>
+              </w:rPr>
+              <w:t>_arrangements</w:t>
+            </w:r>
+            <w:proofErr w:type="spellEnd"/>
             <w:r>
               <w:rPr>
                 <w:b/>
@@ -3758,6 +3888,7 @@
           <w:sz w:val="24"/>
         </w:rPr>
       </w:pPr>
+      <w:proofErr w:type="gramStart"/>
       <w:r>
         <w:rPr>
           <w:b/>
@@ -3782,6 +3913,7 @@
         </w:rPr>
         <w:t>bservations</w:t>
       </w:r>
+      <w:proofErr w:type="gramEnd"/>
       <w:r>
         <w:rPr>
           <w:b/>
@@ -3884,12 +4016,37 @@
           <w:spacing w:val="-2"/>
         </w:rPr>
       </w:pPr>
+      <w:proofErr w:type="gramStart"/>
       <w:r>
         <w:rPr>
           <w:i/>
           <w:spacing w:val="-2"/>
         </w:rPr>
-        <w:t>{{ PICTURE_1 }}</w:t>
+        <w:t>{{ PICTURE</w:t>
+      </w:r>
+      <w:proofErr w:type="gramEnd"/>
+      <w:r>
+        <w:rPr>
+          <w:i/>
+          <w:spacing w:val="-2"/>
+        </w:rPr>
+        <w:t>_</w:t>
+      </w:r>
+      <w:proofErr w:type="gramStart"/>
+      <w:r>
+        <w:rPr>
+          <w:i/>
+          <w:spacing w:val="-2"/>
+        </w:rPr>
+        <w:t>1 }</w:t>
+      </w:r>
+      <w:proofErr w:type="gramEnd"/>
+      <w:r>
+        <w:rPr>
+          <w:i/>
+          <w:spacing w:val="-2"/>
+        </w:rPr>
+        <w:t>}</w:t>
       </w:r>
     </w:p>
     <w:p>
@@ -3918,6 +4075,7 @@
         </w:rPr>
         <w:t xml:space="preserve">Photo 1: </w:t>
       </w:r>
+      <w:proofErr w:type="gramStart"/>
       <w:r>
         <w:rPr>
           <w:i/>
@@ -3930,28 +4088,52 @@
           <w:i/>
           <w:spacing w:val="-2"/>
         </w:rPr>
-        <w:t>Picture_1</w:t>
-      </w:r>
+        <w:t>Picture</w:t>
+      </w:r>
+      <w:proofErr w:type="gramEnd"/>
       <w:r>
         <w:rPr>
           <w:i/>
           <w:spacing w:val="-2"/>
         </w:rPr>
-        <w:t>_Description</w:t>
+        <w:t>_1</w:t>
       </w:r>
       <w:r>
         <w:rPr>
           <w:i/>
           <w:spacing w:val="-2"/>
         </w:rPr>
-        <w:t xml:space="preserve"> </w:t>
-      </w:r>
+        <w:t>_</w:t>
+      </w:r>
+      <w:proofErr w:type="gramStart"/>
       <w:r>
         <w:rPr>
           <w:i/>
           <w:spacing w:val="-2"/>
         </w:rPr>
-        <w:t>}}</w:t>
+        <w:t>Description</w:t>
+      </w:r>
+      <w:r>
+        <w:rPr>
+          <w:i/>
+          <w:spacing w:val="-2"/>
+        </w:rPr>
+        <w:t xml:space="preserve"> </w:t>
+      </w:r>
+      <w:r>
+        <w:rPr>
+          <w:i/>
+          <w:spacing w:val="-2"/>
+        </w:rPr>
+        <w:t>}</w:t>
+      </w:r>
+      <w:proofErr w:type="gramEnd"/>
+      <w:r>
+        <w:rPr>
+          <w:i/>
+          <w:spacing w:val="-2"/>
+        </w:rPr>
+        <w:t>}</w:t>
       </w:r>
     </w:p>
     <w:p>
@@ -3973,18 +4155,28 @@
           <w:spacing w:val="-2"/>
         </w:rPr>
       </w:pPr>
+      <w:proofErr w:type="gramStart"/>
       <w:r>
         <w:rPr>
           <w:i/>
           <w:spacing w:val="-2"/>
         </w:rPr>
-        <w:t>{{ PICTURE_</w:t>
-      </w:r>
+        <w:t>{{ PICTURE</w:t>
+      </w:r>
+      <w:proofErr w:type="gramEnd"/>
       <w:r>
         <w:rPr>
           <w:i/>
           <w:spacing w:val="-2"/>
         </w:rPr>
+        <w:t>_</w:t>
+      </w:r>
+      <w:proofErr w:type="gramStart"/>
+      <w:r>
+        <w:rPr>
+          <w:i/>
+          <w:spacing w:val="-2"/>
+        </w:rPr>
         <w:t>2</w:t>
       </w:r>
       <w:r>
@@ -3992,7 +4184,15 @@
           <w:i/>
           <w:spacing w:val="-2"/>
         </w:rPr>
-        <w:t xml:space="preserve"> }}</w:t>
+        <w:t xml:space="preserve"> }</w:t>
+      </w:r>
+      <w:proofErr w:type="gramEnd"/>
+      <w:r>
+        <w:rPr>
+          <w:i/>
+          <w:spacing w:val="-2"/>
+        </w:rPr>
+        <w:t>}</w:t>
       </w:r>
     </w:p>
     <w:p>
@@ -4021,6 +4221,7 @@
         </w:rPr>
         <w:t xml:space="preserve">Photo 2: </w:t>
       </w:r>
+      <w:proofErr w:type="gramStart"/>
       <w:r>
         <w:rPr>
           <w:i/>
@@ -4033,28 +4234,52 @@
           <w:i/>
           <w:spacing w:val="-2"/>
         </w:rPr>
-        <w:t>Picture_</w:t>
-      </w:r>
+        <w:t>Picture</w:t>
+      </w:r>
+      <w:proofErr w:type="gramEnd"/>
       <w:r>
         <w:rPr>
           <w:i/>
           <w:spacing w:val="-2"/>
         </w:rPr>
-        <w:t>2_Description</w:t>
+        <w:t>_</w:t>
       </w:r>
       <w:r>
         <w:rPr>
           <w:i/>
           <w:spacing w:val="-2"/>
         </w:rPr>
-        <w:t xml:space="preserve"> </w:t>
-      </w:r>
+        <w:t>2_</w:t>
+      </w:r>
+      <w:proofErr w:type="gramStart"/>
       <w:r>
         <w:rPr>
           <w:i/>
           <w:spacing w:val="-2"/>
         </w:rPr>
-        <w:t>}}</w:t>
+        <w:t>Description</w:t>
+      </w:r>
+      <w:r>
+        <w:rPr>
+          <w:i/>
+          <w:spacing w:val="-2"/>
+        </w:rPr>
+        <w:t xml:space="preserve"> </w:t>
+      </w:r>
+      <w:r>
+        <w:rPr>
+          <w:i/>
+          <w:spacing w:val="-2"/>
+        </w:rPr>
+        <w:t>}</w:t>
+      </w:r>
+      <w:proofErr w:type="gramEnd"/>
+      <w:r>
+        <w:rPr>
+          <w:i/>
+          <w:spacing w:val="-2"/>
+        </w:rPr>
+        <w:t>}</w:t>
       </w:r>
     </w:p>
     <w:p>
@@ -4076,18 +4301,28 @@
           <w:spacing w:val="-2"/>
         </w:rPr>
       </w:pPr>
+      <w:proofErr w:type="gramStart"/>
       <w:r>
         <w:rPr>
           <w:i/>
           <w:spacing w:val="-2"/>
         </w:rPr>
-        <w:t>{{ PICTURE_</w:t>
-      </w:r>
+        <w:t>{{ PICTURE</w:t>
+      </w:r>
+      <w:proofErr w:type="gramEnd"/>
       <w:r>
         <w:rPr>
           <w:i/>
           <w:spacing w:val="-2"/>
         </w:rPr>
+        <w:t>_</w:t>
+      </w:r>
+      <w:proofErr w:type="gramStart"/>
+      <w:r>
+        <w:rPr>
+          <w:i/>
+          <w:spacing w:val="-2"/>
+        </w:rPr>
         <w:t>3</w:t>
       </w:r>
       <w:r>
@@ -4095,7 +4330,15 @@
           <w:i/>
           <w:spacing w:val="-2"/>
         </w:rPr>
-        <w:t xml:space="preserve"> }}</w:t>
+        <w:t xml:space="preserve"> }</w:t>
+      </w:r>
+      <w:proofErr w:type="gramEnd"/>
+      <w:r>
+        <w:rPr>
+          <w:i/>
+          <w:spacing w:val="-2"/>
+        </w:rPr>
+        <w:t>}</w:t>
       </w:r>
     </w:p>
     <w:p>
@@ -4124,6 +4367,7 @@
         </w:rPr>
         <w:t xml:space="preserve">Photo 3: </w:t>
       </w:r>
+      <w:proofErr w:type="gramStart"/>
       <w:r>
         <w:rPr>
           <w:i/>
@@ -4136,28 +4380,52 @@
           <w:i/>
           <w:spacing w:val="-2"/>
         </w:rPr>
-        <w:t>Picture_</w:t>
-      </w:r>
+        <w:t>Picture</w:t>
+      </w:r>
+      <w:proofErr w:type="gramEnd"/>
       <w:r>
         <w:rPr>
           <w:i/>
           <w:spacing w:val="-2"/>
         </w:rPr>
-        <w:t>3_Description</w:t>
+        <w:t>_</w:t>
       </w:r>
       <w:r>
         <w:rPr>
           <w:i/>
           <w:spacing w:val="-2"/>
         </w:rPr>
-        <w:t xml:space="preserve"> </w:t>
-      </w:r>
+        <w:t>3_</w:t>
+      </w:r>
+      <w:proofErr w:type="gramStart"/>
       <w:r>
         <w:rPr>
           <w:i/>
           <w:spacing w:val="-2"/>
         </w:rPr>
-        <w:t>}}</w:t>
+        <w:t>Description</w:t>
+      </w:r>
+      <w:r>
+        <w:rPr>
+          <w:i/>
+          <w:spacing w:val="-2"/>
+        </w:rPr>
+        <w:t xml:space="preserve"> </w:t>
+      </w:r>
+      <w:r>
+        <w:rPr>
+          <w:i/>
+          <w:spacing w:val="-2"/>
+        </w:rPr>
+        <w:t>}</w:t>
+      </w:r>
+      <w:proofErr w:type="gramEnd"/>
+      <w:r>
+        <w:rPr>
+          <w:i/>
+          <w:spacing w:val="-2"/>
+        </w:rPr>
+        <w:t>}</w:t>
       </w:r>
     </w:p>
     <w:p>
@@ -4179,18 +4447,28 @@
           <w:spacing w:val="-2"/>
         </w:rPr>
       </w:pPr>
+      <w:proofErr w:type="gramStart"/>
       <w:r>
         <w:rPr>
           <w:i/>
           <w:spacing w:val="-2"/>
         </w:rPr>
-        <w:t>{{ PICTURE_</w:t>
-      </w:r>
+        <w:t>{{ PICTURE</w:t>
+      </w:r>
+      <w:proofErr w:type="gramEnd"/>
       <w:r>
         <w:rPr>
           <w:i/>
           <w:spacing w:val="-2"/>
         </w:rPr>
+        <w:t>_</w:t>
+      </w:r>
+      <w:proofErr w:type="gramStart"/>
+      <w:r>
+        <w:rPr>
+          <w:i/>
+          <w:spacing w:val="-2"/>
+        </w:rPr>
         <w:t>4</w:t>
       </w:r>
       <w:r>
@@ -4198,7 +4476,15 @@
           <w:i/>
           <w:spacing w:val="-2"/>
         </w:rPr>
-        <w:t xml:space="preserve"> }}</w:t>
+        <w:t xml:space="preserve"> }</w:t>
+      </w:r>
+      <w:proofErr w:type="gramEnd"/>
+      <w:r>
+        <w:rPr>
+          <w:i/>
+          <w:spacing w:val="-2"/>
+        </w:rPr>
+        <w:t>}</w:t>
       </w:r>
     </w:p>
     <w:p>
@@ -4227,6 +4513,7 @@
         </w:rPr>
         <w:t xml:space="preserve">Photo 4: </w:t>
       </w:r>
+      <w:proofErr w:type="gramStart"/>
       <w:r>
         <w:rPr>
           <w:i/>
@@ -4239,28 +4526,52 @@
           <w:i/>
           <w:spacing w:val="-2"/>
         </w:rPr>
-        <w:t>Picture_</w:t>
-      </w:r>
+        <w:t>Picture</w:t>
+      </w:r>
+      <w:proofErr w:type="gramEnd"/>
       <w:r>
         <w:rPr>
           <w:i/>
           <w:spacing w:val="-2"/>
         </w:rPr>
-        <w:t>4_Description</w:t>
+        <w:t>_</w:t>
       </w:r>
       <w:r>
         <w:rPr>
           <w:i/>
           <w:spacing w:val="-2"/>
         </w:rPr>
-        <w:t xml:space="preserve"> </w:t>
-      </w:r>
+        <w:t>4_</w:t>
+      </w:r>
+      <w:proofErr w:type="gramStart"/>
       <w:r>
         <w:rPr>
           <w:i/>
           <w:spacing w:val="-2"/>
         </w:rPr>
-        <w:t>}}</w:t>
+        <w:t>Description</w:t>
+      </w:r>
+      <w:r>
+        <w:rPr>
+          <w:i/>
+          <w:spacing w:val="-2"/>
+        </w:rPr>
+        <w:t xml:space="preserve"> </w:t>
+      </w:r>
+      <w:r>
+        <w:rPr>
+          <w:i/>
+          <w:spacing w:val="-2"/>
+        </w:rPr>
+        <w:t>}</w:t>
+      </w:r>
+      <w:proofErr w:type="gramEnd"/>
+      <w:r>
+        <w:rPr>
+          <w:i/>
+          <w:spacing w:val="-2"/>
+        </w:rPr>
+        <w:t>}</w:t>
       </w:r>
     </w:p>
     <w:p>
@@ -4282,18 +4593,28 @@
           <w:spacing w:val="-2"/>
         </w:rPr>
       </w:pPr>
+      <w:proofErr w:type="gramStart"/>
       <w:r>
         <w:rPr>
           <w:i/>
           <w:spacing w:val="-2"/>
         </w:rPr>
-        <w:t>{{ PICTURE_</w:t>
-      </w:r>
+        <w:t>{{ PICTURE</w:t>
+      </w:r>
+      <w:proofErr w:type="gramEnd"/>
       <w:r>
         <w:rPr>
           <w:i/>
           <w:spacing w:val="-2"/>
         </w:rPr>
+        <w:t>_</w:t>
+      </w:r>
+      <w:proofErr w:type="gramStart"/>
+      <w:r>
+        <w:rPr>
+          <w:i/>
+          <w:spacing w:val="-2"/>
+        </w:rPr>
         <w:t>5</w:t>
       </w:r>
       <w:r>
@@ -4301,7 +4622,15 @@
           <w:i/>
           <w:spacing w:val="-2"/>
         </w:rPr>
-        <w:t xml:space="preserve"> }}</w:t>
+        <w:t xml:space="preserve"> }</w:t>
+      </w:r>
+      <w:proofErr w:type="gramEnd"/>
+      <w:r>
+        <w:rPr>
+          <w:i/>
+          <w:spacing w:val="-2"/>
+        </w:rPr>
+        <w:t>}</w:t>
       </w:r>
     </w:p>
     <w:p>
@@ -4330,6 +4659,7 @@
         </w:rPr>
         <w:t xml:space="preserve">Photo 5: </w:t>
       </w:r>
+      <w:proofErr w:type="gramStart"/>
       <w:r>
         <w:rPr>
           <w:i/>
@@ -4342,28 +4672,52 @@
           <w:i/>
           <w:spacing w:val="-2"/>
         </w:rPr>
-        <w:t>Picture_</w:t>
-      </w:r>
+        <w:t>Picture</w:t>
+      </w:r>
+      <w:proofErr w:type="gramEnd"/>
       <w:r>
         <w:rPr>
           <w:i/>
           <w:spacing w:val="-2"/>
         </w:rPr>
-        <w:t>5_Description</w:t>
+        <w:t>_</w:t>
       </w:r>
       <w:r>
         <w:rPr>
           <w:i/>
           <w:spacing w:val="-2"/>
         </w:rPr>
-        <w:t xml:space="preserve"> </w:t>
-      </w:r>
+        <w:t>5_</w:t>
+      </w:r>
+      <w:proofErr w:type="gramStart"/>
       <w:r>
         <w:rPr>
           <w:i/>
           <w:spacing w:val="-2"/>
         </w:rPr>
-        <w:t>}}</w:t>
+        <w:t>Description</w:t>
+      </w:r>
+      <w:r>
+        <w:rPr>
+          <w:i/>
+          <w:spacing w:val="-2"/>
+        </w:rPr>
+        <w:t xml:space="preserve"> </w:t>
+      </w:r>
+      <w:r>
+        <w:rPr>
+          <w:i/>
+          <w:spacing w:val="-2"/>
+        </w:rPr>
+        <w:t>}</w:t>
+      </w:r>
+      <w:proofErr w:type="gramEnd"/>
+      <w:r>
+        <w:rPr>
+          <w:i/>
+          <w:spacing w:val="-2"/>
+        </w:rPr>
+        <w:t>}</w:t>
       </w:r>
     </w:p>
     <w:p>
@@ -4642,6 +4996,7 @@
               </w:rPr>
               <w:t xml:space="preserve"> </w:t>
             </w:r>
+            <w:proofErr w:type="gramStart"/>
             <w:r>
               <w:rPr>
                 <w:i/>
@@ -4654,6 +5009,7 @@
               </w:rPr>
               <w:t>IMMEDIATE</w:t>
             </w:r>
+            <w:proofErr w:type="gramEnd"/>
             <w:r>
               <w:rPr>
                 <w:i/>
@@ -4691,6 +5047,7 @@
               </w:rPr>
               <w:t xml:space="preserve"> </w:t>
             </w:r>
+            <w:proofErr w:type="gramStart"/>
             <w:r>
               <w:rPr>
                 <w:i/>
@@ -4703,6 +5060,7 @@
               </w:rPr>
               <w:t>RESPONSIBILITY</w:t>
             </w:r>
+            <w:proofErr w:type="gramEnd"/>
             <w:r>
               <w:rPr>
                 <w:i/>
@@ -4740,6 +5098,7 @@
               </w:rPr>
               <w:t xml:space="preserve"> </w:t>
             </w:r>
+            <w:proofErr w:type="gramStart"/>
             <w:r>
               <w:rPr>
                 <w:i/>
@@ -4752,6 +5111,7 @@
               </w:rPr>
               <w:t>DEADLINE</w:t>
             </w:r>
+            <w:proofErr w:type="gramEnd"/>
             <w:r>
               <w:rPr>
                 <w:i/>
@@ -4789,6 +5149,7 @@
               </w:rPr>
               <w:t xml:space="preserve"> </w:t>
             </w:r>
+            <w:proofErr w:type="gramStart"/>
             <w:r>
               <w:rPr>
                 <w:i/>
@@ -4801,6 +5162,7 @@
               </w:rPr>
               <w:t>STATUS</w:t>
             </w:r>
+            <w:proofErr w:type="gramEnd"/>
             <w:r>
               <w:rPr>
                 <w:i/>
@@ -4865,6 +5227,7 @@
               </w:rPr>
               <w:t xml:space="preserve"> </w:t>
             </w:r>
+            <w:proofErr w:type="gramStart"/>
             <w:r>
               <w:rPr>
                 <w:i/>
@@ -4877,6 +5240,7 @@
               </w:rPr>
               <w:t>RECOMMEND</w:t>
             </w:r>
+            <w:proofErr w:type="gramEnd"/>
             <w:r>
               <w:rPr>
                 <w:i/>
@@ -4916,6 +5280,7 @@
               </w:rPr>
               <w:t xml:space="preserve"> </w:t>
             </w:r>
+            <w:proofErr w:type="gramStart"/>
             <w:r>
               <w:rPr>
                 <w:i/>
@@ -4928,6 +5293,7 @@
               </w:rPr>
               <w:t>RESPONSIBILITY</w:t>
             </w:r>
+            <w:proofErr w:type="gramEnd"/>
             <w:r>
               <w:rPr>
                 <w:i/>
@@ -4965,6 +5331,7 @@
               </w:rPr>
               <w:t xml:space="preserve"> </w:t>
             </w:r>
+            <w:proofErr w:type="gramStart"/>
             <w:r>
               <w:rPr>
                 <w:i/>
@@ -4977,6 +5344,7 @@
               </w:rPr>
               <w:t>DEADLINE</w:t>
             </w:r>
+            <w:proofErr w:type="gramEnd"/>
             <w:r>
               <w:rPr>
                 <w:i/>
@@ -5016,6 +5384,7 @@
               </w:rPr>
               <w:t xml:space="preserve"> </w:t>
             </w:r>
+            <w:proofErr w:type="gramStart"/>
             <w:r>
               <w:rPr>
                 <w:i/>
@@ -5028,6 +5397,7 @@
               </w:rPr>
               <w:t>STATUS</w:t>
             </w:r>
+            <w:proofErr w:type="gramEnd"/>
             <w:r>
               <w:rPr>
                 <w:i/>
@@ -5099,6 +5469,7 @@
               </w:rPr>
               <w:t xml:space="preserve"> </w:t>
             </w:r>
+            <w:proofErr w:type="gramStart"/>
             <w:r>
               <w:rPr>
                 <w:i/>
@@ -5111,12 +5482,14 @@
               </w:rPr>
               <w:t>FOLLOW</w:t>
             </w:r>
+            <w:proofErr w:type="gramEnd"/>
             <w:r>
               <w:rPr>
                 <w:i/>
               </w:rPr>
               <w:t>_</w:t>
             </w:r>
+            <w:proofErr w:type="gramStart"/>
             <w:r>
               <w:rPr>
                 <w:i/>
@@ -5127,7 +5500,14 @@
               <w:rPr>
                 <w:i/>
               </w:rPr>
-              <w:t xml:space="preserve"> }}</w:t>
+              <w:t xml:space="preserve"> }</w:t>
+            </w:r>
+            <w:proofErr w:type="gramEnd"/>
+            <w:r>
+              <w:rPr>
+                <w:i/>
+              </w:rPr>
+              <w:t>}</w:t>
             </w:r>
           </w:p>
           <w:p>
@@ -5160,6 +5540,7 @@
               </w:rPr>
               <w:t xml:space="preserve"> </w:t>
             </w:r>
+            <w:proofErr w:type="gramStart"/>
             <w:r>
               <w:rPr>
                 <w:i/>
@@ -5172,6 +5553,7 @@
               </w:rPr>
               <w:t>RESPONSIBILITY</w:t>
             </w:r>
+            <w:proofErr w:type="gramEnd"/>
             <w:r>
               <w:rPr>
                 <w:i/>
@@ -5209,6 +5591,7 @@
               </w:rPr>
               <w:t xml:space="preserve"> </w:t>
             </w:r>
+            <w:proofErr w:type="gramStart"/>
             <w:r>
               <w:rPr>
                 <w:i/>
@@ -5221,6 +5604,7 @@
               </w:rPr>
               <w:t>DEADLINE</w:t>
             </w:r>
+            <w:proofErr w:type="gramEnd"/>
             <w:r>
               <w:rPr>
                 <w:i/>
@@ -5258,6 +5642,7 @@
               </w:rPr>
               <w:t xml:space="preserve"> </w:t>
             </w:r>
+            <w:proofErr w:type="gramStart"/>
             <w:r>
               <w:rPr>
                 <w:i/>
@@ -5270,6 +5655,7 @@
               </w:rPr>
               <w:t>STATUS</w:t>
             </w:r>
+            <w:proofErr w:type="gramEnd"/>
             <w:r>
               <w:rPr>
                 <w:i/>
@@ -5334,6 +5720,7 @@
               </w:rPr>
               <w:t xml:space="preserve"> </w:t>
             </w:r>
+            <w:proofErr w:type="gramStart"/>
             <w:r>
               <w:rPr>
                 <w:i/>
@@ -5358,6 +5745,7 @@
               </w:rPr>
               <w:t>T</w:t>
             </w:r>
+            <w:proofErr w:type="gramEnd"/>
             <w:r>
               <w:rPr>
                 <w:i/>
@@ -5395,6 +5783,7 @@
               </w:rPr>
               <w:t xml:space="preserve"> </w:t>
             </w:r>
+            <w:proofErr w:type="gramStart"/>
             <w:r>
               <w:rPr>
                 <w:i/>
@@ -5407,6 +5796,7 @@
               </w:rPr>
               <w:t>RESPONSIBILITY</w:t>
             </w:r>
+            <w:proofErr w:type="gramEnd"/>
             <w:r>
               <w:rPr>
                 <w:i/>
@@ -5444,6 +5834,7 @@
               </w:rPr>
               <w:t xml:space="preserve"> </w:t>
             </w:r>
+            <w:proofErr w:type="gramStart"/>
             <w:r>
               <w:rPr>
                 <w:i/>
@@ -5456,6 +5847,7 @@
               </w:rPr>
               <w:t>DEADLINE</w:t>
             </w:r>
+            <w:proofErr w:type="gramEnd"/>
             <w:r>
               <w:rPr>
                 <w:i/>
@@ -5493,6 +5885,7 @@
               </w:rPr>
               <w:t xml:space="preserve"> </w:t>
             </w:r>
+            <w:proofErr w:type="gramStart"/>
             <w:r>
               <w:rPr>
                 <w:i/>
@@ -5505,6 +5898,7 @@
               </w:rPr>
               <w:t>STATUS</w:t>
             </w:r>
+            <w:proofErr w:type="gramEnd"/>
             <w:r>
               <w:rPr>
                 <w:i/>
@@ -5568,6 +5962,7 @@
               </w:rPr>
               <w:t xml:space="preserve">  </w:t>
             </w:r>
+            <w:proofErr w:type="gramStart"/>
             <w:r>
               <w:rPr>
                 <w:i/>
@@ -5580,6 +5975,7 @@
               </w:rPr>
               <w:t>CONTENT</w:t>
             </w:r>
+            <w:proofErr w:type="gramEnd"/>
             <w:r>
               <w:rPr>
                 <w:i/>
@@ -5617,6 +6013,7 @@
               </w:rPr>
               <w:t xml:space="preserve"> </w:t>
             </w:r>
+            <w:proofErr w:type="gramStart"/>
             <w:r>
               <w:rPr>
                 <w:i/>
@@ -5629,6 +6026,7 @@
               </w:rPr>
               <w:t>RESPONSIBILITY</w:t>
             </w:r>
+            <w:proofErr w:type="gramEnd"/>
             <w:r>
               <w:rPr>
                 <w:i/>
@@ -5666,6 +6064,7 @@
               </w:rPr>
               <w:t xml:space="preserve"> </w:t>
             </w:r>
+            <w:proofErr w:type="gramStart"/>
             <w:r>
               <w:rPr>
                 <w:i/>
@@ -5678,6 +6077,7 @@
               </w:rPr>
               <w:t>DEADLINE</w:t>
             </w:r>
+            <w:proofErr w:type="gramEnd"/>
             <w:r>
               <w:rPr>
                 <w:i/>
@@ -5715,6 +6115,7 @@
               </w:rPr>
               <w:t xml:space="preserve"> </w:t>
             </w:r>
+            <w:proofErr w:type="gramStart"/>
             <w:r>
               <w:rPr>
                 <w:i/>
@@ -5727,6 +6128,7 @@
               </w:rPr>
               <w:t>STATUS</w:t>
             </w:r>
+            <w:proofErr w:type="gramEnd"/>
             <w:r>
               <w:rPr>
                 <w:i/>
@@ -5824,7 +6226,15 @@
           <w:b/>
           <w:spacing w:val="-2"/>
         </w:rPr>
-        <w:t xml:space="preserve"> SAMUEL</w:t>
+        <w:t xml:space="preserve"> </w:t>
+      </w:r>
+      <w:proofErr w:type="gramStart"/>
+      <w:r>
+        <w:rPr>
+          <w:b/>
+          <w:spacing w:val="-2"/>
+        </w:rPr>
+        <w:t>SAMUEL</w:t>
       </w:r>
       <w:r>
         <w:rPr>
@@ -5838,13 +6248,38 @@
           <w:bCs/>
           <w:iCs/>
         </w:rPr>
-        <w:t>SECOND_ADMIN</w:t>
+        <w:t>SECOND</w:t>
+      </w:r>
+      <w:proofErr w:type="gramEnd"/>
+      <w:r>
+        <w:rPr>
+          <w:b/>
+          <w:bCs/>
+          <w:iCs/>
+        </w:rPr>
+        <w:t>_</w:t>
+      </w:r>
+      <w:proofErr w:type="gramStart"/>
+      <w:r>
+        <w:rPr>
+          <w:b/>
+          <w:bCs/>
+          <w:iCs/>
+        </w:rPr>
+        <w:t>ADMIN</w:t>
       </w:r>
       <w:r>
         <w:rPr>
           <w:i/>
         </w:rPr>
-        <w:t xml:space="preserve"> }}</w:t>
+        <w:t xml:space="preserve"> }</w:t>
+      </w:r>
+      <w:proofErr w:type="gramEnd"/>
+      <w:r>
+        <w:rPr>
+          <w:i/>
+        </w:rPr>
+        <w:t>}</w:t>
       </w:r>
     </w:p>
     <w:p>
@@ -9377,7 +9812,6 @@
   <w:style w:type="character" w:default="1" w:styleId="DefaultParagraphFont">
     <w:name w:val="Default Paragraph Font"/>
     <w:uiPriority w:val="1"/>
-    <w:semiHidden/>
     <w:unhideWhenUsed/>
   </w:style>
   <w:style w:type="table" w:default="1" w:styleId="TableNormal">

</xml_diff>

<commit_message>
Made changes to to Master_Template.docx
</commit_message>
<xml_diff>
--- a/Master_Template.docx
+++ b/Master_Template.docx
@@ -1016,29 +1016,35 @@
             <w:r>
               <w:rPr>
                 <w:i/>
+                <w:sz w:val="24"/>
+                <w:szCs w:val="24"/>
               </w:rPr>
               <w:t xml:space="preserve">{{ </w:t>
             </w:r>
-            <w:r>
-              <w:rPr>
-                <w:b/>
-                <w:bCs/>
-                <w:iCs/>
-              </w:rPr>
-              <w:t>SECOND</w:t>
+            <w:proofErr w:type="spellStart"/>
+            <w:r>
+              <w:rPr>
+                <w:iCs/>
+                <w:sz w:val="24"/>
+                <w:szCs w:val="24"/>
+              </w:rPr>
+              <w:t>second</w:t>
             </w:r>
             <w:proofErr w:type="gramEnd"/>
             <w:r>
               <w:rPr>
-                <w:b/>
-                <w:bCs/>
-                <w:iCs/>
-              </w:rPr>
-              <w:t>_ADMIN</w:t>
-            </w:r>
+                <w:iCs/>
+                <w:sz w:val="24"/>
+                <w:szCs w:val="24"/>
+              </w:rPr>
+              <w:t>_admin</w:t>
+            </w:r>
+            <w:proofErr w:type="spellEnd"/>
             <w:r>
               <w:rPr>
                 <w:i/>
+                <w:sz w:val="24"/>
+                <w:szCs w:val="24"/>
               </w:rPr>
               <w:t xml:space="preserve"> }}</w:t>
             </w:r>
@@ -2277,13 +2283,7 @@
         <w:rPr>
           <w:sz w:val="24"/>
         </w:rPr>
-        <w:t xml:space="preserve">{{ </w:t>
-      </w:r>
-      <w:r>
-        <w:rPr>
-          <w:sz w:val="24"/>
-        </w:rPr>
-        <w:t>MODULE</w:t>
+        <w:t>{{ MODULE</w:t>
       </w:r>
       <w:proofErr w:type="gramEnd"/>
       <w:r>
@@ -2297,13 +2297,7 @@
         <w:rPr>
           <w:sz w:val="24"/>
         </w:rPr>
-        <w:t>TITLE</w:t>
-      </w:r>
-      <w:r>
-        <w:rPr>
-          <w:sz w:val="24"/>
-        </w:rPr>
-        <w:t xml:space="preserve"> }</w:t>
+        <w:t>TITLE }</w:t>
       </w:r>
       <w:proofErr w:type="gramEnd"/>
       <w:r>
@@ -2442,57 +2436,53 @@
     </w:p>
     <w:p>
       <w:pPr>
-        <w:pStyle w:val="TableParagraph"/>
-        <w:spacing w:line="275" w:lineRule="exact"/>
-        <w:ind w:left="0"/>
-        <w:rPr>
-          <w:sz w:val="24"/>
-        </w:rPr>
-      </w:pPr>
-    </w:p>
-    <w:p>
-      <w:pPr>
-        <w:pStyle w:val="TableParagraph"/>
-        <w:spacing w:line="275" w:lineRule="exact"/>
-        <w:ind w:left="0"/>
-        <w:rPr>
-          <w:sz w:val="24"/>
-        </w:rPr>
-      </w:pPr>
-      <w:r>
-        <w:rPr>
-          <w:sz w:val="24"/>
-        </w:rPr>
-        <w:tab/>
-      </w:r>
+        <w:pStyle w:val="BodyText"/>
+        <w:spacing w:before="202"/>
+        <w:ind w:left="720"/>
+        <w:rPr>
+          <w:spacing w:val="-2"/>
+        </w:rPr>
+      </w:pPr>
+    </w:p>
+    <w:p>
+      <w:pPr>
+        <w:pStyle w:val="BodyText"/>
+        <w:spacing w:before="202"/>
+        <w:ind w:left="720"/>
+      </w:pPr>
       <w:proofErr w:type="gramStart"/>
       <w:r>
-        <w:rPr>
-          <w:sz w:val="24"/>
-        </w:rPr>
         <w:t>{{ OUTLINE</w:t>
       </w:r>
       <w:proofErr w:type="gramEnd"/>
       <w:r>
-        <w:rPr>
-          <w:sz w:val="24"/>
-        </w:rPr>
         <w:t>_</w:t>
       </w:r>
       <w:proofErr w:type="gramStart"/>
       <w:r>
-        <w:rPr>
-          <w:sz w:val="24"/>
-        </w:rPr>
         <w:t>TABLE }</w:t>
       </w:r>
       <w:proofErr w:type="gramEnd"/>
       <w:r>
-        <w:rPr>
-          <w:sz w:val="24"/>
-        </w:rPr>
         <w:t>}</w:t>
       </w:r>
+    </w:p>
+    <w:p>
+      <w:pPr>
+        <w:pStyle w:val="BodyText"/>
+        <w:spacing w:before="202"/>
+        <w:ind w:left="720"/>
+      </w:pPr>
+    </w:p>
+    <w:p>
+      <w:pPr>
+        <w:pStyle w:val="BodyText"/>
+        <w:spacing w:before="202"/>
+        <w:ind w:left="720"/>
+        <w:rPr>
+          <w:spacing w:val="-2"/>
+        </w:rPr>
+      </w:pPr>
     </w:p>
     <w:p>
       <w:pPr>
@@ -2556,41 +2546,57 @@
           <w:tab w:val="left" w:pos="1080"/>
         </w:tabs>
         <w:ind w:left="1080"/>
-      </w:pPr>
-      <w:proofErr w:type="gramStart"/>
-      <w:r>
-        <w:t xml:space="preserve">{{ </w:t>
-      </w:r>
-      <w:proofErr w:type="spellStart"/>
-      <w:r>
         <w:rPr>
           <w:b w:val="0"/>
           <w:bCs w:val="0"/>
         </w:rPr>
-        <w:t>learning</w:t>
-      </w:r>
-      <w:proofErr w:type="gramEnd"/>
+      </w:pPr>
+      <w:proofErr w:type="gramStart"/>
       <w:r>
         <w:rPr>
           <w:b w:val="0"/>
           <w:bCs w:val="0"/>
         </w:rPr>
-        <w:t>_</w:t>
-      </w:r>
-      <w:proofErr w:type="gramStart"/>
+        <w:t xml:space="preserve">{{ </w:t>
+      </w:r>
+      <w:proofErr w:type="spellStart"/>
       <w:r>
         <w:rPr>
           <w:b w:val="0"/>
           <w:bCs w:val="0"/>
         </w:rPr>
+        <w:t>learning</w:t>
+      </w:r>
+      <w:proofErr w:type="gramEnd"/>
+      <w:r>
+        <w:rPr>
+          <w:b w:val="0"/>
+          <w:bCs w:val="0"/>
+        </w:rPr>
+        <w:t>_</w:t>
+      </w:r>
+      <w:proofErr w:type="gramStart"/>
+      <w:r>
+        <w:rPr>
+          <w:b w:val="0"/>
+          <w:bCs w:val="0"/>
+        </w:rPr>
         <w:t>objectives</w:t>
       </w:r>
       <w:proofErr w:type="spellEnd"/>
       <w:r>
+        <w:rPr>
+          <w:b w:val="0"/>
+          <w:bCs w:val="0"/>
+        </w:rPr>
         <w:t xml:space="preserve"> }</w:t>
       </w:r>
       <w:proofErr w:type="gramEnd"/>
       <w:r>
+        <w:rPr>
+          <w:b w:val="0"/>
+          <w:bCs w:val="0"/>
+        </w:rPr>
         <w:t>}</w:t>
       </w:r>
     </w:p>
@@ -2627,48 +2633,64 @@
         </w:tabs>
         <w:spacing w:before="201"/>
         <w:ind w:left="1080"/>
-      </w:pPr>
-      <w:proofErr w:type="gramStart"/>
-      <w:r>
-        <w:t xml:space="preserve">{{ </w:t>
-      </w:r>
-      <w:proofErr w:type="spellStart"/>
-      <w:r>
         <w:rPr>
           <w:b w:val="0"/>
           <w:bCs w:val="0"/>
         </w:rPr>
-        <w:t>learning</w:t>
-      </w:r>
-      <w:proofErr w:type="gramEnd"/>
+      </w:pPr>
+      <w:proofErr w:type="gramStart"/>
       <w:r>
         <w:rPr>
           <w:b w:val="0"/>
           <w:bCs w:val="0"/>
         </w:rPr>
-        <w:t>_</w:t>
-      </w:r>
-      <w:proofErr w:type="gramStart"/>
+        <w:t xml:space="preserve">{{ </w:t>
+      </w:r>
+      <w:proofErr w:type="spellStart"/>
       <w:r>
         <w:rPr>
           <w:b w:val="0"/>
           <w:bCs w:val="0"/>
         </w:rPr>
-        <w:t>o</w:t>
-      </w:r>
+        <w:t>learning</w:t>
+      </w:r>
+      <w:proofErr w:type="gramEnd"/>
       <w:r>
         <w:rPr>
           <w:b w:val="0"/>
           <w:bCs w:val="0"/>
         </w:rPr>
+        <w:t>_</w:t>
+      </w:r>
+      <w:proofErr w:type="gramStart"/>
+      <w:r>
+        <w:rPr>
+          <w:b w:val="0"/>
+          <w:bCs w:val="0"/>
+        </w:rPr>
+        <w:t>o</w:t>
+      </w:r>
+      <w:r>
+        <w:rPr>
+          <w:b w:val="0"/>
+          <w:bCs w:val="0"/>
+        </w:rPr>
         <w:t>utcomes</w:t>
       </w:r>
       <w:proofErr w:type="spellEnd"/>
       <w:r>
+        <w:rPr>
+          <w:b w:val="0"/>
+          <w:bCs w:val="0"/>
+        </w:rPr>
         <w:t xml:space="preserve"> }</w:t>
       </w:r>
       <w:proofErr w:type="gramEnd"/>
       <w:r>
+        <w:rPr>
+          <w:b w:val="0"/>
+          <w:bCs w:val="0"/>
+        </w:rPr>
         <w:t>}</w:t>
       </w:r>
     </w:p>
@@ -2946,11 +2968,15 @@
               <w:spacing w:before="1"/>
               <w:ind w:left="110"/>
               <w:rPr>
+                <w:b/>
+                <w:bCs/>
                 <w:sz w:val="24"/>
               </w:rPr>
             </w:pPr>
             <w:r>
               <w:rPr>
+                <w:b/>
+                <w:bCs/>
                 <w:spacing w:val="-2"/>
                 <w:sz w:val="24"/>
               </w:rPr>
@@ -2968,11 +2994,15 @@
               <w:spacing w:before="1"/>
               <w:ind w:left="109"/>
               <w:rPr>
+                <w:b/>
+                <w:bCs/>
                 <w:sz w:val="24"/>
               </w:rPr>
             </w:pPr>
             <w:r>
               <w:rPr>
+                <w:b/>
+                <w:bCs/>
                 <w:spacing w:val="-2"/>
                 <w:sz w:val="24"/>
               </w:rPr>
@@ -2995,11 +3025,15 @@
               <w:spacing w:line="275" w:lineRule="exact"/>
               <w:ind w:left="110"/>
               <w:rPr>
+                <w:b/>
+                <w:bCs/>
                 <w:sz w:val="24"/>
               </w:rPr>
             </w:pPr>
             <w:r>
               <w:rPr>
+                <w:b/>
+                <w:bCs/>
                 <w:spacing w:val="-2"/>
                 <w:sz w:val="24"/>
               </w:rPr>
@@ -3017,28 +3051,18 @@
               <w:spacing w:line="275" w:lineRule="exact"/>
               <w:ind w:left="109"/>
               <w:rPr>
-                <w:b/>
                 <w:sz w:val="24"/>
               </w:rPr>
             </w:pPr>
             <w:proofErr w:type="gramStart"/>
             <w:r>
-              <w:rPr>
-                <w:b/>
-              </w:rPr>
               <w:t xml:space="preserve">{{ </w:t>
             </w:r>
             <w:r>
-              <w:rPr>
-                <w:bCs/>
-              </w:rPr>
               <w:t>attendance</w:t>
             </w:r>
             <w:proofErr w:type="gramEnd"/>
             <w:r>
-              <w:rPr>
-                <w:b/>
-              </w:rPr>
               <w:t xml:space="preserve"> }}</w:t>
             </w:r>
           </w:p>
@@ -3058,17 +3082,23 @@
               <w:spacing w:line="275" w:lineRule="exact"/>
               <w:ind w:left="110"/>
               <w:rPr>
+                <w:b/>
+                <w:bCs/>
                 <w:sz w:val="24"/>
               </w:rPr>
             </w:pPr>
             <w:r>
               <w:rPr>
+                <w:b/>
+                <w:bCs/>
                 <w:sz w:val="24"/>
               </w:rPr>
               <w:t>Engagement</w:t>
             </w:r>
             <w:r>
               <w:rPr>
+                <w:b/>
+                <w:bCs/>
                 <w:spacing w:val="-3"/>
                 <w:sz w:val="24"/>
               </w:rPr>
@@ -3076,6 +3106,8 @@
             </w:r>
             <w:r>
               <w:rPr>
+                <w:b/>
+                <w:bCs/>
                 <w:spacing w:val="-4"/>
                 <w:sz w:val="24"/>
               </w:rPr>
@@ -3097,30 +3129,18 @@
             </w:pPr>
             <w:proofErr w:type="gramStart"/>
             <w:r>
-              <w:rPr>
-                <w:b/>
-              </w:rPr>
               <w:t xml:space="preserve">{{ </w:t>
             </w:r>
             <w:proofErr w:type="spellStart"/>
             <w:r>
-              <w:rPr>
-                <w:bCs/>
-              </w:rPr>
               <w:t>engagement</w:t>
             </w:r>
             <w:proofErr w:type="gramEnd"/>
             <w:r>
-              <w:rPr>
-                <w:bCs/>
-              </w:rPr>
               <w:t>_level</w:t>
             </w:r>
             <w:proofErr w:type="spellEnd"/>
             <w:r>
-              <w:rPr>
-                <w:b/>
-              </w:rPr>
               <w:t xml:space="preserve"> }}</w:t>
             </w:r>
           </w:p>
@@ -3140,17 +3160,23 @@
               <w:spacing w:before="1"/>
               <w:ind w:left="110"/>
               <w:rPr>
+                <w:b/>
+                <w:bCs/>
                 <w:sz w:val="24"/>
               </w:rPr>
             </w:pPr>
             <w:r>
               <w:rPr>
+                <w:b/>
+                <w:bCs/>
                 <w:sz w:val="24"/>
               </w:rPr>
               <w:t>Participant</w:t>
             </w:r>
             <w:r>
               <w:rPr>
+                <w:b/>
+                <w:bCs/>
                 <w:spacing w:val="-2"/>
                 <w:sz w:val="24"/>
               </w:rPr>
@@ -3173,36 +3199,21 @@
             </w:pPr>
             <w:proofErr w:type="gramStart"/>
             <w:r>
-              <w:rPr>
-                <w:b/>
-              </w:rPr>
               <w:t xml:space="preserve">{{ </w:t>
             </w:r>
             <w:proofErr w:type="spellStart"/>
             <w:r>
-              <w:rPr>
-                <w:bCs/>
-              </w:rPr>
               <w:t>participant</w:t>
             </w:r>
             <w:proofErr w:type="gramEnd"/>
             <w:r>
-              <w:rPr>
-                <w:bCs/>
-              </w:rPr>
               <w:t>_</w:t>
             </w:r>
             <w:r>
-              <w:rPr>
-                <w:bCs/>
-              </w:rPr>
               <w:t>feedback</w:t>
             </w:r>
             <w:proofErr w:type="spellEnd"/>
             <w:r>
-              <w:rPr>
-                <w:b/>
-              </w:rPr>
               <w:t xml:space="preserve"> }}</w:t>
             </w:r>
           </w:p>
@@ -3222,17 +3233,23 @@
               <w:spacing w:line="275" w:lineRule="exact"/>
               <w:ind w:left="110"/>
               <w:rPr>
+                <w:b/>
+                <w:bCs/>
                 <w:sz w:val="24"/>
               </w:rPr>
             </w:pPr>
             <w:r>
               <w:rPr>
+                <w:b/>
+                <w:bCs/>
                 <w:sz w:val="24"/>
               </w:rPr>
               <w:t>Assessment</w:t>
             </w:r>
             <w:r>
               <w:rPr>
+                <w:b/>
+                <w:bCs/>
                 <w:spacing w:val="-2"/>
                 <w:sz w:val="24"/>
               </w:rPr>
@@ -3393,11 +3410,15 @@
               <w:spacing w:before="1"/>
               <w:ind w:left="110"/>
               <w:rPr>
+                <w:b/>
+                <w:bCs/>
                 <w:sz w:val="24"/>
               </w:rPr>
             </w:pPr>
             <w:r>
               <w:rPr>
+                <w:b/>
+                <w:bCs/>
                 <w:spacing w:val="-2"/>
                 <w:sz w:val="24"/>
               </w:rPr>
@@ -3415,11 +3436,15 @@
               <w:spacing w:before="1"/>
               <w:ind w:left="109"/>
               <w:rPr>
+                <w:b/>
+                <w:bCs/>
                 <w:sz w:val="24"/>
               </w:rPr>
             </w:pPr>
             <w:r>
               <w:rPr>
+                <w:b/>
+                <w:bCs/>
                 <w:spacing w:val="-2"/>
                 <w:sz w:val="24"/>
               </w:rPr>
@@ -3442,17 +3467,23 @@
               <w:spacing w:line="275" w:lineRule="exact"/>
               <w:ind w:left="110"/>
               <w:rPr>
+                <w:b/>
+                <w:bCs/>
                 <w:sz w:val="24"/>
               </w:rPr>
             </w:pPr>
             <w:r>
               <w:rPr>
+                <w:b/>
+                <w:bCs/>
                 <w:sz w:val="24"/>
               </w:rPr>
               <w:t>Content</w:t>
             </w:r>
             <w:r>
               <w:rPr>
+                <w:b/>
+                <w:bCs/>
                 <w:spacing w:val="-2"/>
                 <w:sz w:val="24"/>
               </w:rPr>
@@ -3474,30 +3505,18 @@
             </w:pPr>
             <w:proofErr w:type="gramStart"/>
             <w:r>
-              <w:rPr>
-                <w:b/>
-              </w:rPr>
               <w:t xml:space="preserve">{{ </w:t>
             </w:r>
             <w:proofErr w:type="spellStart"/>
             <w:r>
-              <w:rPr>
-                <w:bCs/>
-              </w:rPr>
               <w:t>content</w:t>
             </w:r>
             <w:proofErr w:type="gramEnd"/>
             <w:r>
-              <w:rPr>
-                <w:bCs/>
-              </w:rPr>
               <w:t>_quality</w:t>
             </w:r>
             <w:proofErr w:type="spellEnd"/>
             <w:r>
-              <w:rPr>
-                <w:b/>
-              </w:rPr>
               <w:t xml:space="preserve"> }}</w:t>
             </w:r>
           </w:p>
@@ -3517,17 +3536,23 @@
               <w:spacing w:before="1"/>
               <w:ind w:left="110"/>
               <w:rPr>
+                <w:b/>
+                <w:bCs/>
                 <w:sz w:val="24"/>
               </w:rPr>
             </w:pPr>
             <w:r>
               <w:rPr>
+                <w:b/>
+                <w:bCs/>
                 <w:sz w:val="24"/>
               </w:rPr>
               <w:t>Trainer</w:t>
             </w:r>
             <w:r>
               <w:rPr>
+                <w:b/>
+                <w:bCs/>
                 <w:spacing w:val="-4"/>
                 <w:sz w:val="24"/>
               </w:rPr>
@@ -3535,6 +3560,8 @@
             </w:r>
             <w:r>
               <w:rPr>
+                <w:b/>
+                <w:bCs/>
                 <w:spacing w:val="-2"/>
                 <w:sz w:val="24"/>
               </w:rPr>
@@ -3557,36 +3584,21 @@
             </w:pPr>
             <w:proofErr w:type="gramStart"/>
             <w:r>
-              <w:rPr>
-                <w:b/>
-              </w:rPr>
               <w:t xml:space="preserve">{{ </w:t>
             </w:r>
             <w:proofErr w:type="spellStart"/>
             <w:r>
-              <w:rPr>
-                <w:bCs/>
-              </w:rPr>
               <w:t>trainer</w:t>
             </w:r>
             <w:proofErr w:type="gramEnd"/>
             <w:r>
-              <w:rPr>
-                <w:bCs/>
-              </w:rPr>
               <w:t>_</w:t>
             </w:r>
             <w:r>
-              <w:rPr>
-                <w:bCs/>
-              </w:rPr>
               <w:t>effectiveness</w:t>
             </w:r>
             <w:proofErr w:type="spellEnd"/>
             <w:r>
-              <w:rPr>
-                <w:b/>
-              </w:rPr>
               <w:t xml:space="preserve"> }}</w:t>
             </w:r>
           </w:p>
@@ -3606,17 +3618,23 @@
               <w:spacing w:line="275" w:lineRule="exact"/>
               <w:ind w:left="110"/>
               <w:rPr>
+                <w:b/>
+                <w:bCs/>
                 <w:sz w:val="24"/>
               </w:rPr>
             </w:pPr>
             <w:r>
               <w:rPr>
+                <w:b/>
+                <w:bCs/>
                 <w:sz w:val="24"/>
               </w:rPr>
               <w:t>Material</w:t>
             </w:r>
             <w:r>
               <w:rPr>
+                <w:b/>
+                <w:bCs/>
                 <w:spacing w:val="-2"/>
                 <w:sz w:val="24"/>
               </w:rPr>
@@ -3624,12 +3642,16 @@
             </w:r>
             <w:r>
               <w:rPr>
+                <w:b/>
+                <w:bCs/>
                 <w:sz w:val="24"/>
               </w:rPr>
               <w:t>&amp;</w:t>
             </w:r>
             <w:r>
               <w:rPr>
+                <w:b/>
+                <w:bCs/>
                 <w:spacing w:val="-1"/>
                 <w:sz w:val="24"/>
               </w:rPr>
@@ -3637,6 +3659,8 @@
             </w:r>
             <w:r>
               <w:rPr>
+                <w:b/>
+                <w:bCs/>
                 <w:spacing w:val="-2"/>
                 <w:sz w:val="24"/>
               </w:rPr>
@@ -3658,30 +3682,18 @@
             </w:pPr>
             <w:proofErr w:type="gramStart"/>
             <w:r>
-              <w:rPr>
-                <w:b/>
-              </w:rPr>
               <w:t xml:space="preserve">{{ </w:t>
             </w:r>
             <w:proofErr w:type="spellStart"/>
             <w:r>
-              <w:rPr>
-                <w:bCs/>
-              </w:rPr>
               <w:t>materials</w:t>
             </w:r>
             <w:proofErr w:type="gramEnd"/>
             <w:r>
-              <w:rPr>
-                <w:bCs/>
-              </w:rPr>
               <w:t>_resources</w:t>
             </w:r>
             <w:proofErr w:type="spellEnd"/>
             <w:r>
-              <w:rPr>
-                <w:b/>
-              </w:rPr>
               <w:t xml:space="preserve"> }}</w:t>
             </w:r>
           </w:p>
@@ -3701,17 +3713,23 @@
               <w:spacing w:line="275" w:lineRule="exact"/>
               <w:ind w:left="110"/>
               <w:rPr>
+                <w:b/>
+                <w:bCs/>
                 <w:sz w:val="24"/>
               </w:rPr>
             </w:pPr>
             <w:r>
               <w:rPr>
+                <w:b/>
+                <w:bCs/>
                 <w:sz w:val="24"/>
               </w:rPr>
               <w:t>Technical</w:t>
             </w:r>
             <w:r>
               <w:rPr>
+                <w:b/>
+                <w:bCs/>
                 <w:spacing w:val="-5"/>
                 <w:sz w:val="24"/>
               </w:rPr>
@@ -3719,6 +3737,8 @@
             </w:r>
             <w:r>
               <w:rPr>
+                <w:b/>
+                <w:bCs/>
                 <w:spacing w:val="-2"/>
                 <w:sz w:val="24"/>
               </w:rPr>
@@ -3740,36 +3760,21 @@
             </w:pPr>
             <w:proofErr w:type="gramStart"/>
             <w:r>
-              <w:rPr>
-                <w:b/>
-              </w:rPr>
               <w:t xml:space="preserve">{{ </w:t>
             </w:r>
             <w:proofErr w:type="spellStart"/>
             <w:r>
-              <w:rPr>
-                <w:bCs/>
-              </w:rPr>
               <w:t>technical</w:t>
             </w:r>
             <w:proofErr w:type="gramEnd"/>
             <w:r>
-              <w:rPr>
-                <w:bCs/>
-              </w:rPr>
               <w:t>_</w:t>
             </w:r>
             <w:r>
-              <w:rPr>
-                <w:bCs/>
-              </w:rPr>
               <w:t>support</w:t>
             </w:r>
             <w:proofErr w:type="spellEnd"/>
             <w:r>
-              <w:rPr>
-                <w:b/>
-              </w:rPr>
               <w:t xml:space="preserve"> }}</w:t>
             </w:r>
           </w:p>
@@ -3789,17 +3794,23 @@
               <w:spacing w:before="1"/>
               <w:ind w:left="110"/>
               <w:rPr>
+                <w:b/>
+                <w:bCs/>
                 <w:sz w:val="24"/>
               </w:rPr>
             </w:pPr>
             <w:r>
               <w:rPr>
+                <w:b/>
+                <w:bCs/>
                 <w:sz w:val="24"/>
               </w:rPr>
               <w:t>Logistical</w:t>
             </w:r>
             <w:r>
               <w:rPr>
+                <w:b/>
+                <w:bCs/>
                 <w:spacing w:val="-2"/>
                 <w:sz w:val="24"/>
               </w:rPr>
@@ -3822,30 +3833,18 @@
             </w:pPr>
             <w:proofErr w:type="gramStart"/>
             <w:r>
-              <w:rPr>
-                <w:b/>
-              </w:rPr>
               <w:t xml:space="preserve">{{ </w:t>
             </w:r>
             <w:proofErr w:type="spellStart"/>
             <w:r>
-              <w:rPr>
-                <w:bCs/>
-              </w:rPr>
               <w:t>logistical</w:t>
             </w:r>
             <w:proofErr w:type="gramEnd"/>
             <w:r>
-              <w:rPr>
-                <w:bCs/>
-              </w:rPr>
               <w:t>_arrangements</w:t>
             </w:r>
             <w:proofErr w:type="spellEnd"/>
             <w:r>
-              <w:rPr>
-                <w:b/>
-              </w:rPr>
               <w:t xml:space="preserve"> }}</w:t>
             </w:r>
           </w:p>
@@ -3884,14 +3883,14 @@
         </w:tabs>
         <w:ind w:left="720"/>
         <w:rPr>
-          <w:b/>
+          <w:bCs/>
           <w:sz w:val="24"/>
         </w:rPr>
       </w:pPr>
       <w:proofErr w:type="gramStart"/>
       <w:r>
         <w:rPr>
-          <w:b/>
+          <w:bCs/>
           <w:spacing w:val="-2"/>
           <w:sz w:val="24"/>
         </w:rPr>
@@ -3903,20 +3902,12 @@
           <w:spacing w:val="-2"/>
           <w:sz w:val="24"/>
         </w:rPr>
-        <w:t>O</w:t>
-      </w:r>
+        <w:t>Observations</w:t>
+      </w:r>
+      <w:proofErr w:type="gramEnd"/>
       <w:r>
         <w:rPr>
           <w:bCs/>
-          <w:spacing w:val="-2"/>
-          <w:sz w:val="24"/>
-        </w:rPr>
-        <w:t>bservations</w:t>
-      </w:r>
-      <w:proofErr w:type="gramEnd"/>
-      <w:r>
-        <w:rPr>
-          <w:b/>
           <w:spacing w:val="-2"/>
           <w:sz w:val="24"/>
         </w:rPr>
@@ -4821,8 +4812,8 @@
         <w:gridCol w:w="1884"/>
         <w:gridCol w:w="2373"/>
         <w:gridCol w:w="2588"/>
-        <w:gridCol w:w="1843"/>
-        <w:gridCol w:w="1949"/>
+        <w:gridCol w:w="1985"/>
+        <w:gridCol w:w="1807"/>
       </w:tblGrid>
       <w:tr>
         <w:trPr>
@@ -4895,7 +4886,7 @@
         </w:tc>
         <w:tc>
           <w:tcPr>
-            <w:tcW w:w="1843" w:type="dxa"/>
+            <w:tcW w:w="1985" w:type="dxa"/>
           </w:tcPr>
           <w:p>
             <w:pPr>
@@ -4917,7 +4908,7 @@
         </w:tc>
         <w:tc>
           <w:tcPr>
-            <w:tcW w:w="1949" w:type="dxa"/>
+            <w:tcW w:w="1807" w:type="dxa"/>
           </w:tcPr>
           <w:p>
             <w:pPr>
@@ -4987,32 +4978,27 @@
               <w:spacing w:before="7"/>
               <w:rPr>
                 <w:b/>
+                <w:iCs/>
                 <w:sz w:val="17"/>
               </w:rPr>
             </w:pPr>
             <w:r>
               <w:rPr>
-                <w:i/>
+                <w:iCs/>
               </w:rPr>
               <w:t xml:space="preserve"> </w:t>
             </w:r>
             <w:proofErr w:type="gramStart"/>
             <w:r>
               <w:rPr>
-                <w:i/>
-              </w:rPr>
-              <w:t xml:space="preserve">{{ </w:t>
-            </w:r>
-            <w:r>
-              <w:rPr>
-                <w:i/>
-              </w:rPr>
-              <w:t>IMMEDIATE</w:t>
+                <w:iCs/>
+              </w:rPr>
+              <w:t>{{ IMMEDIATE</w:t>
             </w:r>
             <w:proofErr w:type="gramEnd"/>
             <w:r>
               <w:rPr>
-                <w:i/>
+                <w:iCs/>
               </w:rPr>
               <w:t xml:space="preserve"> }}</w:t>
             </w:r>
@@ -5023,6 +5009,7 @@
               <w:spacing w:before="1"/>
               <w:ind w:left="109"/>
               <w:rPr>
+                <w:iCs/>
                 <w:sz w:val="24"/>
               </w:rPr>
             </w:pPr>
@@ -5038,32 +5025,27 @@
               <w:spacing w:before="7"/>
               <w:rPr>
                 <w:b/>
+                <w:iCs/>
                 <w:sz w:val="17"/>
               </w:rPr>
             </w:pPr>
             <w:r>
               <w:rPr>
-                <w:i/>
+                <w:iCs/>
               </w:rPr>
               <w:t xml:space="preserve"> </w:t>
             </w:r>
             <w:proofErr w:type="gramStart"/>
             <w:r>
               <w:rPr>
-                <w:i/>
-              </w:rPr>
-              <w:t xml:space="preserve">{{ </w:t>
-            </w:r>
-            <w:r>
-              <w:rPr>
-                <w:i/>
-              </w:rPr>
-              <w:t>RESPONSIBILITY</w:t>
+                <w:iCs/>
+              </w:rPr>
+              <w:t>{{ RESPONSIBILITY</w:t>
             </w:r>
             <w:proofErr w:type="gramEnd"/>
             <w:r>
               <w:rPr>
-                <w:i/>
+                <w:iCs/>
               </w:rPr>
               <w:t xml:space="preserve"> }}</w:t>
             </w:r>
@@ -5074,6 +5056,7 @@
               <w:spacing w:before="1"/>
               <w:ind w:left="106"/>
               <w:rPr>
+                <w:iCs/>
                 <w:sz w:val="24"/>
               </w:rPr>
             </w:pPr>
@@ -5081,7 +5064,7 @@
         </w:tc>
         <w:tc>
           <w:tcPr>
-            <w:tcW w:w="1843" w:type="dxa"/>
+            <w:tcW w:w="1985" w:type="dxa"/>
           </w:tcPr>
           <w:p>
             <w:pPr>
@@ -5089,32 +5072,27 @@
               <w:spacing w:before="7"/>
               <w:rPr>
                 <w:b/>
+                <w:iCs/>
                 <w:sz w:val="17"/>
               </w:rPr>
             </w:pPr>
             <w:r>
               <w:rPr>
-                <w:i/>
+                <w:iCs/>
               </w:rPr>
               <w:t xml:space="preserve"> </w:t>
             </w:r>
             <w:proofErr w:type="gramStart"/>
             <w:r>
               <w:rPr>
-                <w:i/>
-              </w:rPr>
-              <w:t xml:space="preserve">{{ </w:t>
-            </w:r>
-            <w:r>
-              <w:rPr>
-                <w:i/>
-              </w:rPr>
-              <w:t>DEADLINE</w:t>
+                <w:iCs/>
+              </w:rPr>
+              <w:t>{{ DEADLINE</w:t>
             </w:r>
             <w:proofErr w:type="gramEnd"/>
             <w:r>
               <w:rPr>
-                <w:i/>
+                <w:iCs/>
               </w:rPr>
               <w:t xml:space="preserve"> }}</w:t>
             </w:r>
@@ -5125,6 +5103,7 @@
               <w:spacing w:before="1"/>
               <w:ind w:left="106"/>
               <w:rPr>
+                <w:iCs/>
                 <w:sz w:val="24"/>
               </w:rPr>
             </w:pPr>
@@ -5132,7 +5111,7 @@
         </w:tc>
         <w:tc>
           <w:tcPr>
-            <w:tcW w:w="1949" w:type="dxa"/>
+            <w:tcW w:w="1807" w:type="dxa"/>
           </w:tcPr>
           <w:p>
             <w:pPr>
@@ -5140,32 +5119,27 @@
               <w:spacing w:before="7"/>
               <w:rPr>
                 <w:b/>
+                <w:iCs/>
                 <w:sz w:val="17"/>
               </w:rPr>
             </w:pPr>
             <w:r>
               <w:rPr>
-                <w:i/>
+                <w:iCs/>
               </w:rPr>
               <w:t xml:space="preserve"> </w:t>
             </w:r>
             <w:proofErr w:type="gramStart"/>
             <w:r>
               <w:rPr>
-                <w:i/>
-              </w:rPr>
-              <w:t xml:space="preserve">{{ </w:t>
-            </w:r>
-            <w:r>
-              <w:rPr>
-                <w:i/>
-              </w:rPr>
-              <w:t>STATUS</w:t>
+                <w:iCs/>
+              </w:rPr>
+              <w:t>{{ STATUS</w:t>
             </w:r>
             <w:proofErr w:type="gramEnd"/>
             <w:r>
               <w:rPr>
-                <w:i/>
+                <w:iCs/>
               </w:rPr>
               <w:t xml:space="preserve"> }}</w:t>
             </w:r>
@@ -5176,6 +5150,7 @@
               <w:spacing w:before="1"/>
               <w:ind w:left="106"/>
               <w:rPr>
+                <w:iCs/>
                 <w:sz w:val="24"/>
               </w:rPr>
             </w:pPr>
@@ -5218,32 +5193,27 @@
               <w:spacing w:before="7"/>
               <w:rPr>
                 <w:b/>
+                <w:iCs/>
                 <w:sz w:val="17"/>
               </w:rPr>
             </w:pPr>
             <w:r>
               <w:rPr>
-                <w:i/>
+                <w:iCs/>
               </w:rPr>
               <w:t xml:space="preserve"> </w:t>
             </w:r>
             <w:proofErr w:type="gramStart"/>
             <w:r>
               <w:rPr>
-                <w:i/>
-              </w:rPr>
-              <w:t xml:space="preserve">{{ </w:t>
-            </w:r>
-            <w:r>
-              <w:rPr>
-                <w:i/>
-              </w:rPr>
-              <w:t>RECOMMEND</w:t>
+                <w:iCs/>
+              </w:rPr>
+              <w:t>{{ RECOMMEND</w:t>
             </w:r>
             <w:proofErr w:type="gramEnd"/>
             <w:r>
               <w:rPr>
-                <w:i/>
+                <w:iCs/>
               </w:rPr>
               <w:t xml:space="preserve"> }}</w:t>
             </w:r>
@@ -5256,6 +5226,7 @@
               </w:tabs>
               <w:ind w:left="829" w:right="132"/>
               <w:rPr>
+                <w:iCs/>
                 <w:sz w:val="24"/>
               </w:rPr>
             </w:pPr>
@@ -5271,32 +5242,27 @@
               <w:spacing w:before="7"/>
               <w:rPr>
                 <w:b/>
+                <w:iCs/>
                 <w:sz w:val="17"/>
               </w:rPr>
             </w:pPr>
             <w:r>
               <w:rPr>
-                <w:i/>
+                <w:iCs/>
               </w:rPr>
               <w:t xml:space="preserve"> </w:t>
             </w:r>
             <w:proofErr w:type="gramStart"/>
             <w:r>
               <w:rPr>
-                <w:i/>
-              </w:rPr>
-              <w:t xml:space="preserve">{{ </w:t>
-            </w:r>
-            <w:r>
-              <w:rPr>
-                <w:i/>
-              </w:rPr>
-              <w:t>RESPONSIBILITY</w:t>
+                <w:iCs/>
+              </w:rPr>
+              <w:t>{{ RESPONSIBILITY</w:t>
             </w:r>
             <w:proofErr w:type="gramEnd"/>
             <w:r>
               <w:rPr>
-                <w:i/>
+                <w:iCs/>
               </w:rPr>
               <w:t xml:space="preserve"> }}</w:t>
             </w:r>
@@ -5307,6 +5273,7 @@
               <w:spacing w:line="412" w:lineRule="auto"/>
               <w:ind w:left="106" w:right="576"/>
               <w:rPr>
+                <w:iCs/>
                 <w:sz w:val="24"/>
               </w:rPr>
             </w:pPr>
@@ -5314,7 +5281,7 @@
         </w:tc>
         <w:tc>
           <w:tcPr>
-            <w:tcW w:w="1843" w:type="dxa"/>
+            <w:tcW w:w="1985" w:type="dxa"/>
           </w:tcPr>
           <w:p>
             <w:pPr>
@@ -5322,32 +5289,27 @@
               <w:spacing w:before="7"/>
               <w:rPr>
                 <w:b/>
+                <w:iCs/>
                 <w:sz w:val="17"/>
               </w:rPr>
             </w:pPr>
             <w:r>
               <w:rPr>
-                <w:i/>
+                <w:iCs/>
               </w:rPr>
               <w:t xml:space="preserve"> </w:t>
             </w:r>
             <w:proofErr w:type="gramStart"/>
             <w:r>
               <w:rPr>
-                <w:i/>
-              </w:rPr>
-              <w:t xml:space="preserve">{{ </w:t>
-            </w:r>
-            <w:r>
-              <w:rPr>
-                <w:i/>
-              </w:rPr>
-              <w:t>DEADLINE</w:t>
+                <w:iCs/>
+              </w:rPr>
+              <w:t>{{ DEADLINE</w:t>
             </w:r>
             <w:proofErr w:type="gramEnd"/>
             <w:r>
               <w:rPr>
-                <w:i/>
+                <w:iCs/>
               </w:rPr>
               <w:t xml:space="preserve"> }}</w:t>
             </w:r>
@@ -5360,6 +5322,7 @@
               </w:tabs>
               <w:ind w:left="0" w:right="155"/>
               <w:rPr>
+                <w:iCs/>
                 <w:sz w:val="24"/>
               </w:rPr>
             </w:pPr>
@@ -5367,7 +5330,7 @@
         </w:tc>
         <w:tc>
           <w:tcPr>
-            <w:tcW w:w="1949" w:type="dxa"/>
+            <w:tcW w:w="1807" w:type="dxa"/>
           </w:tcPr>
           <w:p>
             <w:pPr>
@@ -5375,32 +5338,27 @@
               <w:spacing w:before="7"/>
               <w:rPr>
                 <w:b/>
+                <w:iCs/>
                 <w:sz w:val="17"/>
               </w:rPr>
             </w:pPr>
             <w:r>
               <w:rPr>
-                <w:i/>
+                <w:iCs/>
               </w:rPr>
               <w:t xml:space="preserve"> </w:t>
             </w:r>
             <w:proofErr w:type="gramStart"/>
             <w:r>
               <w:rPr>
-                <w:i/>
-              </w:rPr>
-              <w:t xml:space="preserve">{{ </w:t>
-            </w:r>
-            <w:r>
-              <w:rPr>
-                <w:i/>
-              </w:rPr>
-              <w:t>STATUS</w:t>
+                <w:iCs/>
+              </w:rPr>
+              <w:t>{{ STATUS</w:t>
             </w:r>
             <w:proofErr w:type="gramEnd"/>
             <w:r>
               <w:rPr>
-                <w:i/>
+                <w:iCs/>
               </w:rPr>
               <w:t xml:space="preserve"> }}</w:t>
             </w:r>
@@ -5411,6 +5369,7 @@
               <w:spacing w:line="275" w:lineRule="exact"/>
               <w:ind w:left="106"/>
               <w:rPr>
+                <w:iCs/>
                 <w:sz w:val="24"/>
               </w:rPr>
             </w:pPr>
@@ -5460,52 +5419,41 @@
               <w:spacing w:before="7"/>
               <w:rPr>
                 <w:b/>
+                <w:iCs/>
                 <w:sz w:val="17"/>
               </w:rPr>
             </w:pPr>
             <w:r>
               <w:rPr>
-                <w:i/>
+                <w:iCs/>
               </w:rPr>
               <w:t xml:space="preserve"> </w:t>
             </w:r>
             <w:proofErr w:type="gramStart"/>
             <w:r>
               <w:rPr>
-                <w:i/>
-              </w:rPr>
-              <w:t xml:space="preserve">{{ </w:t>
-            </w:r>
-            <w:r>
-              <w:rPr>
-                <w:i/>
-              </w:rPr>
-              <w:t>FOLLOW</w:t>
+                <w:iCs/>
+              </w:rPr>
+              <w:t>{{ FOLLOW</w:t>
             </w:r>
             <w:proofErr w:type="gramEnd"/>
             <w:r>
               <w:rPr>
-                <w:i/>
+                <w:iCs/>
               </w:rPr>
               <w:t>_</w:t>
             </w:r>
             <w:proofErr w:type="gramStart"/>
             <w:r>
               <w:rPr>
-                <w:i/>
-              </w:rPr>
-              <w:t>UP</w:t>
-            </w:r>
-            <w:r>
-              <w:rPr>
-                <w:i/>
-              </w:rPr>
-              <w:t xml:space="preserve"> }</w:t>
+                <w:iCs/>
+              </w:rPr>
+              <w:t>UP }</w:t>
             </w:r>
             <w:proofErr w:type="gramEnd"/>
             <w:r>
               <w:rPr>
-                <w:i/>
+                <w:iCs/>
               </w:rPr>
               <w:t>}</w:t>
             </w:r>
@@ -5516,6 +5464,7 @@
               <w:spacing w:line="275" w:lineRule="exact"/>
               <w:ind w:left="109"/>
               <w:rPr>
+                <w:iCs/>
                 <w:sz w:val="24"/>
               </w:rPr>
             </w:pPr>
@@ -5531,32 +5480,27 @@
               <w:spacing w:before="7"/>
               <w:rPr>
                 <w:b/>
+                <w:iCs/>
                 <w:sz w:val="17"/>
               </w:rPr>
             </w:pPr>
             <w:r>
               <w:rPr>
-                <w:i/>
+                <w:iCs/>
               </w:rPr>
               <w:t xml:space="preserve"> </w:t>
             </w:r>
             <w:proofErr w:type="gramStart"/>
             <w:r>
               <w:rPr>
-                <w:i/>
-              </w:rPr>
-              <w:t xml:space="preserve">{{ </w:t>
-            </w:r>
-            <w:r>
-              <w:rPr>
-                <w:i/>
-              </w:rPr>
-              <w:t>RESPONSIBILITY</w:t>
+                <w:iCs/>
+              </w:rPr>
+              <w:t>{{ RESPONSIBILITY</w:t>
             </w:r>
             <w:proofErr w:type="gramEnd"/>
             <w:r>
               <w:rPr>
-                <w:i/>
+                <w:iCs/>
               </w:rPr>
               <w:t xml:space="preserve"> }}</w:t>
             </w:r>
@@ -5567,6 +5511,7 @@
               <w:spacing w:line="275" w:lineRule="exact"/>
               <w:ind w:left="106"/>
               <w:rPr>
+                <w:iCs/>
                 <w:sz w:val="24"/>
               </w:rPr>
             </w:pPr>
@@ -5574,7 +5519,7 @@
         </w:tc>
         <w:tc>
           <w:tcPr>
-            <w:tcW w:w="1843" w:type="dxa"/>
+            <w:tcW w:w="1985" w:type="dxa"/>
           </w:tcPr>
           <w:p>
             <w:pPr>
@@ -5582,32 +5527,27 @@
               <w:spacing w:before="7"/>
               <w:rPr>
                 <w:b/>
+                <w:iCs/>
                 <w:sz w:val="17"/>
               </w:rPr>
             </w:pPr>
             <w:r>
               <w:rPr>
-                <w:i/>
+                <w:iCs/>
               </w:rPr>
               <w:t xml:space="preserve"> </w:t>
             </w:r>
             <w:proofErr w:type="gramStart"/>
             <w:r>
               <w:rPr>
-                <w:i/>
-              </w:rPr>
-              <w:t xml:space="preserve">{{ </w:t>
-            </w:r>
-            <w:r>
-              <w:rPr>
-                <w:i/>
-              </w:rPr>
-              <w:t>DEADLINE</w:t>
+                <w:iCs/>
+              </w:rPr>
+              <w:t>{{ DEADLINE</w:t>
             </w:r>
             <w:proofErr w:type="gramEnd"/>
             <w:r>
               <w:rPr>
-                <w:i/>
+                <w:iCs/>
               </w:rPr>
               <w:t xml:space="preserve"> }}</w:t>
             </w:r>
@@ -5618,6 +5558,7 @@
               <w:spacing w:line="275" w:lineRule="exact"/>
               <w:ind w:left="106"/>
               <w:rPr>
+                <w:iCs/>
                 <w:sz w:val="24"/>
               </w:rPr>
             </w:pPr>
@@ -5625,7 +5566,7 @@
         </w:tc>
         <w:tc>
           <w:tcPr>
-            <w:tcW w:w="1949" w:type="dxa"/>
+            <w:tcW w:w="1807" w:type="dxa"/>
           </w:tcPr>
           <w:p>
             <w:pPr>
@@ -5633,32 +5574,27 @@
               <w:spacing w:before="7"/>
               <w:rPr>
                 <w:b/>
+                <w:iCs/>
                 <w:sz w:val="17"/>
               </w:rPr>
             </w:pPr>
             <w:r>
               <w:rPr>
-                <w:i/>
+                <w:iCs/>
               </w:rPr>
               <w:t xml:space="preserve"> </w:t>
             </w:r>
             <w:proofErr w:type="gramStart"/>
             <w:r>
               <w:rPr>
-                <w:i/>
-              </w:rPr>
-              <w:t xml:space="preserve">{{ </w:t>
-            </w:r>
-            <w:r>
-              <w:rPr>
-                <w:i/>
-              </w:rPr>
-              <w:t>STATUS</w:t>
+                <w:iCs/>
+              </w:rPr>
+              <w:t>{{ STATUS</w:t>
             </w:r>
             <w:proofErr w:type="gramEnd"/>
             <w:r>
               <w:rPr>
-                <w:i/>
+                <w:iCs/>
               </w:rPr>
               <w:t xml:space="preserve"> }}</w:t>
             </w:r>
@@ -5669,6 +5605,7 @@
               <w:spacing w:line="275" w:lineRule="exact"/>
               <w:ind w:left="106"/>
               <w:rPr>
+                <w:iCs/>
                 <w:sz w:val="24"/>
               </w:rPr>
             </w:pPr>
@@ -5711,44 +5648,39 @@
               <w:spacing w:before="7"/>
               <w:rPr>
                 <w:b/>
+                <w:iCs/>
                 <w:sz w:val="17"/>
               </w:rPr>
             </w:pPr>
             <w:r>
               <w:rPr>
-                <w:i/>
+                <w:iCs/>
               </w:rPr>
               <w:t xml:space="preserve"> </w:t>
             </w:r>
             <w:proofErr w:type="gramStart"/>
             <w:r>
               <w:rPr>
-                <w:i/>
-              </w:rPr>
-              <w:t xml:space="preserve">{{ </w:t>
-            </w:r>
-            <w:r>
-              <w:rPr>
-                <w:i/>
-              </w:rPr>
-              <w:t>IMPROVEME</w:t>
-            </w:r>
-            <w:r>
-              <w:rPr>
-                <w:i/>
+                <w:iCs/>
+              </w:rPr>
+              <w:t>{{ IMPROVEME</w:t>
+            </w:r>
+            <w:r>
+              <w:rPr>
+                <w:iCs/>
               </w:rPr>
               <w:t>N</w:t>
             </w:r>
             <w:r>
               <w:rPr>
-                <w:i/>
+                <w:iCs/>
               </w:rPr>
               <w:t>T</w:t>
             </w:r>
             <w:proofErr w:type="gramEnd"/>
             <w:r>
               <w:rPr>
-                <w:i/>
+                <w:iCs/>
               </w:rPr>
               <w:t xml:space="preserve"> }}</w:t>
             </w:r>
@@ -5759,6 +5691,7 @@
               <w:spacing w:before="1"/>
               <w:ind w:left="109"/>
               <w:rPr>
+                <w:iCs/>
                 <w:sz w:val="24"/>
               </w:rPr>
             </w:pPr>
@@ -5774,32 +5707,27 @@
               <w:spacing w:before="7"/>
               <w:rPr>
                 <w:b/>
+                <w:iCs/>
                 <w:sz w:val="17"/>
               </w:rPr>
             </w:pPr>
             <w:r>
               <w:rPr>
-                <w:i/>
+                <w:iCs/>
               </w:rPr>
               <w:t xml:space="preserve"> </w:t>
             </w:r>
             <w:proofErr w:type="gramStart"/>
             <w:r>
               <w:rPr>
-                <w:i/>
-              </w:rPr>
-              <w:t xml:space="preserve">{{ </w:t>
-            </w:r>
-            <w:r>
-              <w:rPr>
-                <w:i/>
-              </w:rPr>
-              <w:t>RESPONSIBILITY</w:t>
+                <w:iCs/>
+              </w:rPr>
+              <w:t>{{ RESPONSIBILITY</w:t>
             </w:r>
             <w:proofErr w:type="gramEnd"/>
             <w:r>
               <w:rPr>
-                <w:i/>
+                <w:iCs/>
               </w:rPr>
               <w:t xml:space="preserve"> }}</w:t>
             </w:r>
@@ -5810,6 +5738,7 @@
               <w:spacing w:before="1"/>
               <w:ind w:left="106"/>
               <w:rPr>
+                <w:iCs/>
                 <w:sz w:val="24"/>
               </w:rPr>
             </w:pPr>
@@ -5817,7 +5746,7 @@
         </w:tc>
         <w:tc>
           <w:tcPr>
-            <w:tcW w:w="1843" w:type="dxa"/>
+            <w:tcW w:w="1985" w:type="dxa"/>
           </w:tcPr>
           <w:p>
             <w:pPr>
@@ -5825,32 +5754,27 @@
               <w:spacing w:before="7"/>
               <w:rPr>
                 <w:b/>
+                <w:iCs/>
                 <w:sz w:val="17"/>
               </w:rPr>
             </w:pPr>
             <w:r>
               <w:rPr>
-                <w:i/>
+                <w:iCs/>
               </w:rPr>
               <w:t xml:space="preserve"> </w:t>
             </w:r>
             <w:proofErr w:type="gramStart"/>
             <w:r>
               <w:rPr>
-                <w:i/>
-              </w:rPr>
-              <w:t xml:space="preserve">{{ </w:t>
-            </w:r>
-            <w:r>
-              <w:rPr>
-                <w:i/>
-              </w:rPr>
-              <w:t>DEADLINE</w:t>
+                <w:iCs/>
+              </w:rPr>
+              <w:t>{{ DEADLINE</w:t>
             </w:r>
             <w:proofErr w:type="gramEnd"/>
             <w:r>
               <w:rPr>
-                <w:i/>
+                <w:iCs/>
               </w:rPr>
               <w:t xml:space="preserve"> }}</w:t>
             </w:r>
@@ -5861,6 +5785,7 @@
               <w:spacing w:before="1"/>
               <w:ind w:left="106"/>
               <w:rPr>
+                <w:iCs/>
                 <w:sz w:val="24"/>
               </w:rPr>
             </w:pPr>
@@ -5868,7 +5793,7 @@
         </w:tc>
         <w:tc>
           <w:tcPr>
-            <w:tcW w:w="1949" w:type="dxa"/>
+            <w:tcW w:w="1807" w:type="dxa"/>
           </w:tcPr>
           <w:p>
             <w:pPr>
@@ -5876,32 +5801,27 @@
               <w:spacing w:before="7"/>
               <w:rPr>
                 <w:b/>
+                <w:iCs/>
                 <w:sz w:val="17"/>
               </w:rPr>
             </w:pPr>
             <w:r>
               <w:rPr>
-                <w:i/>
+                <w:iCs/>
               </w:rPr>
               <w:t xml:space="preserve"> </w:t>
             </w:r>
             <w:proofErr w:type="gramStart"/>
             <w:r>
               <w:rPr>
-                <w:i/>
-              </w:rPr>
-              <w:t xml:space="preserve">{{ </w:t>
-            </w:r>
-            <w:r>
-              <w:rPr>
-                <w:i/>
-              </w:rPr>
-              <w:t>STATUS</w:t>
+                <w:iCs/>
+              </w:rPr>
+              <w:t>{{ STATUS</w:t>
             </w:r>
             <w:proofErr w:type="gramEnd"/>
             <w:r>
               <w:rPr>
-                <w:i/>
+                <w:iCs/>
               </w:rPr>
               <w:t xml:space="preserve"> }}</w:t>
             </w:r>
@@ -5912,6 +5832,7 @@
               <w:spacing w:before="1"/>
               <w:ind w:left="106"/>
               <w:rPr>
+                <w:iCs/>
                 <w:sz w:val="24"/>
               </w:rPr>
             </w:pPr>
@@ -5953,32 +5874,27 @@
               <w:spacing w:before="7"/>
               <w:rPr>
                 <w:b/>
+                <w:iCs/>
                 <w:sz w:val="17"/>
               </w:rPr>
             </w:pPr>
             <w:r>
               <w:rPr>
-                <w:i/>
+                <w:iCs/>
               </w:rPr>
               <w:t xml:space="preserve">  </w:t>
             </w:r>
             <w:proofErr w:type="gramStart"/>
             <w:r>
               <w:rPr>
-                <w:i/>
-              </w:rPr>
-              <w:t xml:space="preserve">{{ </w:t>
-            </w:r>
-            <w:r>
-              <w:rPr>
-                <w:i/>
-              </w:rPr>
-              <w:t>CONTENT</w:t>
+                <w:iCs/>
+              </w:rPr>
+              <w:t>{{ CONTENT</w:t>
             </w:r>
             <w:proofErr w:type="gramEnd"/>
             <w:r>
               <w:rPr>
-                <w:i/>
+                <w:iCs/>
               </w:rPr>
               <w:t xml:space="preserve"> }}</w:t>
             </w:r>
@@ -5989,6 +5905,7 @@
               <w:spacing w:line="275" w:lineRule="exact"/>
               <w:ind w:left="109"/>
               <w:rPr>
+                <w:iCs/>
                 <w:sz w:val="24"/>
               </w:rPr>
             </w:pPr>
@@ -6004,32 +5921,27 @@
               <w:spacing w:before="7"/>
               <w:rPr>
                 <w:b/>
+                <w:iCs/>
                 <w:sz w:val="17"/>
               </w:rPr>
             </w:pPr>
             <w:r>
               <w:rPr>
-                <w:i/>
+                <w:iCs/>
               </w:rPr>
               <w:t xml:space="preserve"> </w:t>
             </w:r>
             <w:proofErr w:type="gramStart"/>
             <w:r>
               <w:rPr>
-                <w:i/>
-              </w:rPr>
-              <w:t xml:space="preserve">{{ </w:t>
-            </w:r>
-            <w:r>
-              <w:rPr>
-                <w:i/>
-              </w:rPr>
-              <w:t>RESPONSIBILITY</w:t>
+                <w:iCs/>
+              </w:rPr>
+              <w:t>{{ RESPONSIBILITY</w:t>
             </w:r>
             <w:proofErr w:type="gramEnd"/>
             <w:r>
               <w:rPr>
-                <w:i/>
+                <w:iCs/>
               </w:rPr>
               <w:t xml:space="preserve"> }}</w:t>
             </w:r>
@@ -6040,6 +5952,7 @@
               <w:spacing w:line="275" w:lineRule="exact"/>
               <w:ind w:left="106"/>
               <w:rPr>
+                <w:iCs/>
                 <w:sz w:val="24"/>
               </w:rPr>
             </w:pPr>
@@ -6047,7 +5960,7 @@
         </w:tc>
         <w:tc>
           <w:tcPr>
-            <w:tcW w:w="1843" w:type="dxa"/>
+            <w:tcW w:w="1985" w:type="dxa"/>
           </w:tcPr>
           <w:p>
             <w:pPr>
@@ -6055,32 +5968,27 @@
               <w:spacing w:before="7"/>
               <w:rPr>
                 <w:b/>
+                <w:iCs/>
                 <w:sz w:val="17"/>
               </w:rPr>
             </w:pPr>
             <w:r>
               <w:rPr>
-                <w:i/>
+                <w:iCs/>
               </w:rPr>
               <w:t xml:space="preserve"> </w:t>
             </w:r>
             <w:proofErr w:type="gramStart"/>
             <w:r>
               <w:rPr>
-                <w:i/>
-              </w:rPr>
-              <w:t xml:space="preserve">{{ </w:t>
-            </w:r>
-            <w:r>
-              <w:rPr>
-                <w:i/>
-              </w:rPr>
-              <w:t>DEADLINE</w:t>
+                <w:iCs/>
+              </w:rPr>
+              <w:t>{{ DEADLINE</w:t>
             </w:r>
             <w:proofErr w:type="gramEnd"/>
             <w:r>
               <w:rPr>
-                <w:i/>
+                <w:iCs/>
               </w:rPr>
               <w:t xml:space="preserve"> }}</w:t>
             </w:r>
@@ -6091,6 +5999,7 @@
               <w:spacing w:line="275" w:lineRule="exact"/>
               <w:ind w:left="106"/>
               <w:rPr>
+                <w:iCs/>
                 <w:sz w:val="24"/>
               </w:rPr>
             </w:pPr>
@@ -6098,7 +6007,7 @@
         </w:tc>
         <w:tc>
           <w:tcPr>
-            <w:tcW w:w="1949" w:type="dxa"/>
+            <w:tcW w:w="1807" w:type="dxa"/>
           </w:tcPr>
           <w:p>
             <w:pPr>
@@ -6106,32 +6015,27 @@
               <w:spacing w:before="7"/>
               <w:rPr>
                 <w:b/>
+                <w:iCs/>
                 <w:sz w:val="17"/>
               </w:rPr>
             </w:pPr>
             <w:r>
               <w:rPr>
-                <w:i/>
+                <w:iCs/>
               </w:rPr>
               <w:t xml:space="preserve"> </w:t>
             </w:r>
             <w:proofErr w:type="gramStart"/>
             <w:r>
               <w:rPr>
-                <w:i/>
-              </w:rPr>
-              <w:t xml:space="preserve">{{ </w:t>
-            </w:r>
-            <w:r>
-              <w:rPr>
-                <w:i/>
-              </w:rPr>
-              <w:t>STATUS</w:t>
+                <w:iCs/>
+              </w:rPr>
+              <w:t>{{ STATUS</w:t>
             </w:r>
             <w:proofErr w:type="gramEnd"/>
             <w:r>
               <w:rPr>
-                <w:i/>
+                <w:iCs/>
               </w:rPr>
               <w:t xml:space="preserve"> }}</w:t>
             </w:r>
@@ -6142,6 +6046,7 @@
               <w:spacing w:line="275" w:lineRule="exact"/>
               <w:ind w:left="106"/>
               <w:rPr>
+                <w:iCs/>
                 <w:sz w:val="24"/>
               </w:rPr>
             </w:pPr>
@@ -6217,13 +6122,13 @@
       </w:r>
       <w:r>
         <w:rPr>
-          <w:b/>
+          <w:bCs/>
         </w:rPr>
         <w:t>ABIYE</w:t>
       </w:r>
       <w:r>
         <w:rPr>
-          <w:b/>
+          <w:bCs/>
           <w:spacing w:val="-2"/>
         </w:rPr>
         <w:t xml:space="preserve"> </w:t>
@@ -6231,7 +6136,7 @@
       <w:proofErr w:type="gramStart"/>
       <w:r>
         <w:rPr>
-          <w:b/>
+          <w:bCs/>
           <w:spacing w:val="-2"/>
         </w:rPr>
         <w:t>SAMUEL</w:t>
@@ -6242,19 +6147,16 @@
         </w:rPr>
         <w:t xml:space="preserve">{{ </w:t>
       </w:r>
-      <w:r>
-        <w:rPr>
-          <w:b/>
-          <w:bCs/>
+      <w:proofErr w:type="spellStart"/>
+      <w:r>
+        <w:rPr>
           <w:iCs/>
         </w:rPr>
-        <w:t>SECOND</w:t>
+        <w:t>second</w:t>
       </w:r>
       <w:proofErr w:type="gramEnd"/>
       <w:r>
         <w:rPr>
-          <w:b/>
-          <w:bCs/>
           <w:iCs/>
         </w:rPr>
         <w:t>_</w:t>
@@ -6262,12 +6164,11 @@
       <w:proofErr w:type="gramStart"/>
       <w:r>
         <w:rPr>
-          <w:b/>
-          <w:bCs/>
           <w:iCs/>
         </w:rPr>
-        <w:t>ADMIN</w:t>
-      </w:r>
+        <w:t>admin</w:t>
+      </w:r>
+      <w:proofErr w:type="spellEnd"/>
       <w:r>
         <w:rPr>
           <w:i/>
@@ -6356,39 +6257,67 @@
         <w:pStyle w:val="BodyText"/>
         <w:spacing w:before="1"/>
         <w:ind w:left="720"/>
-      </w:pPr>
-      <w:r>
+        <w:rPr>
+          <w:b/>
+          <w:bCs/>
+        </w:rPr>
+      </w:pPr>
+      <w:r>
+        <w:rPr>
+          <w:b/>
+          <w:bCs/>
+        </w:rPr>
         <w:t>Name</w:t>
       </w:r>
       <w:r>
         <w:rPr>
+          <w:b/>
+          <w:bCs/>
           <w:spacing w:val="-1"/>
         </w:rPr>
         <w:t xml:space="preserve"> </w:t>
       </w:r>
       <w:r>
+        <w:rPr>
+          <w:b/>
+          <w:bCs/>
+        </w:rPr>
         <w:t>&amp;</w:t>
       </w:r>
       <w:r>
         <w:rPr>
+          <w:b/>
+          <w:bCs/>
           <w:spacing w:val="-1"/>
         </w:rPr>
         <w:t xml:space="preserve"> </w:t>
       </w:r>
       <w:r>
+        <w:rPr>
+          <w:b/>
+          <w:bCs/>
+        </w:rPr>
         <w:t>Signature</w:t>
       </w:r>
       <w:r>
         <w:rPr>
-          <w:spacing w:val="-2"/>
-        </w:rPr>
-        <w:t xml:space="preserve"> </w:t>
-      </w:r>
-      <w:r>
+          <w:b/>
+          <w:bCs/>
+          <w:spacing w:val="-2"/>
+        </w:rPr>
+        <w:t xml:space="preserve"> </w:t>
+      </w:r>
+      <w:r>
+        <w:rPr>
+          <w:b/>
+          <w:bCs/>
+        </w:rPr>
         <w:t xml:space="preserve">of </w:t>
       </w:r>
       <w:r>
         <w:rPr>
+          <w:b/>
+          <w:bCs/>
           <w:spacing w:val="-2"/>
         </w:rPr>
         <w:t>Reporter</w:t>
@@ -9812,6 +9741,7 @@
   <w:style w:type="character" w:default="1" w:styleId="DefaultParagraphFont">
     <w:name w:val="Default Paragraph Font"/>
     <w:uiPriority w:val="1"/>
+    <w:semiHidden/>
     <w:unhideWhenUsed/>
   </w:style>
   <w:style w:type="table" w:default="1" w:styleId="TableNormal">

</xml_diff>

<commit_message>
Made changes to to Master_Template.docx and the app.py files
</commit_message>
<xml_diff>
--- a/Master_Template.docx
+++ b/Master_Template.docx
@@ -728,8 +728,8 @@
           <w:sz w:val="24"/>
         </w:rPr>
         <w:sectPr>
-          <w:headerReference w:type="default" r:id="rId7"/>
-          <w:footerReference w:type="default" r:id="rId8"/>
+          <w:headerReference w:type="default" r:id="rId8"/>
+          <w:footerReference w:type="default" r:id="rId9"/>
           <w:type w:val="continuous"/>
           <w:pgSz w:w="12240" w:h="15840"/>
           <w:pgMar w:top="1340" w:right="720" w:bottom="600" w:left="720" w:header="235" w:footer="417" w:gutter="0"/>
@@ -2448,21 +2448,8 @@
         <w:spacing w:before="202"/>
         <w:ind w:left="720"/>
       </w:pPr>
-      <w:proofErr w:type="gramStart"/>
-      <w:r>
-        <w:t>{{ OUTLINE</w:t>
-      </w:r>
-      <w:proofErr w:type="gramEnd"/>
-      <w:r>
-        <w:t>_</w:t>
-      </w:r>
-      <w:proofErr w:type="gramStart"/>
-      <w:r>
-        <w:t>TABLE }</w:t>
-      </w:r>
-      <w:proofErr w:type="gramEnd"/>
-      <w:r>
-        <w:t>}</w:t>
+      <w:r>
+        <w:t>{{ OUTLINE_TABLE }}</w:t>
       </w:r>
     </w:p>
     <w:p>
@@ -2549,53 +2536,12 @@
           <w:bCs w:val="0"/>
         </w:rPr>
       </w:pPr>
-      <w:proofErr w:type="gramStart"/>
       <w:r>
         <w:rPr>
           <w:b w:val="0"/>
           <w:bCs w:val="0"/>
         </w:rPr>
-        <w:t xml:space="preserve">{{ </w:t>
-      </w:r>
-      <w:proofErr w:type="spellStart"/>
-      <w:r>
-        <w:rPr>
-          <w:b w:val="0"/>
-          <w:bCs w:val="0"/>
-        </w:rPr>
-        <w:t>learning</w:t>
-      </w:r>
-      <w:proofErr w:type="gramEnd"/>
-      <w:r>
-        <w:rPr>
-          <w:b w:val="0"/>
-          <w:bCs w:val="0"/>
-        </w:rPr>
-        <w:t>_</w:t>
-      </w:r>
-      <w:proofErr w:type="gramStart"/>
-      <w:r>
-        <w:rPr>
-          <w:b w:val="0"/>
-          <w:bCs w:val="0"/>
-        </w:rPr>
-        <w:t>objectives</w:t>
-      </w:r>
-      <w:proofErr w:type="spellEnd"/>
-      <w:r>
-        <w:rPr>
-          <w:b w:val="0"/>
-          <w:bCs w:val="0"/>
-        </w:rPr>
-        <w:t xml:space="preserve"> }</w:t>
-      </w:r>
-      <w:proofErr w:type="gramEnd"/>
-      <w:r>
-        <w:rPr>
-          <w:b w:val="0"/>
-          <w:bCs w:val="0"/>
-        </w:rPr>
-        <w:t>}</w:t>
+        <w:t>{{ learning_objectives }}</w:t>
       </w:r>
     </w:p>
     <w:p>
@@ -2636,146 +2582,78 @@
           <w:bCs w:val="0"/>
         </w:rPr>
       </w:pPr>
-      <w:proofErr w:type="gramStart"/>
       <w:r>
         <w:rPr>
           <w:b w:val="0"/>
           <w:bCs w:val="0"/>
         </w:rPr>
-        <w:t xml:space="preserve">{{ </w:t>
-      </w:r>
-      <w:proofErr w:type="spellStart"/>
+        <w:t>{{ learning_o</w:t>
+      </w:r>
       <w:r>
         <w:rPr>
           <w:b w:val="0"/>
           <w:bCs w:val="0"/>
         </w:rPr>
-        <w:t>learning</w:t>
-      </w:r>
-      <w:proofErr w:type="gramEnd"/>
+        <w:t>utcomes</w:t>
+      </w:r>
       <w:r>
         <w:rPr>
           <w:b w:val="0"/>
           <w:bCs w:val="0"/>
         </w:rPr>
-        <w:t>_</w:t>
-      </w:r>
-      <w:proofErr w:type="gramStart"/>
-      <w:r>
+        <w:t xml:space="preserve"> }}</w:t>
+      </w:r>
+    </w:p>
+    <w:p>
+      <w:pPr>
+        <w:pStyle w:val="Heading1"/>
+        <w:spacing w:before="200"/>
+      </w:pPr>
+      <w:r>
+        <w:t>Demonstrated</w:t>
+      </w:r>
+      <w:r>
+        <w:rPr>
+          <w:spacing w:val="-6"/>
+        </w:rPr>
+        <w:t xml:space="preserve"> </w:t>
+      </w:r>
+      <w:r>
+        <w:rPr>
+          <w:spacing w:val="-2"/>
+        </w:rPr>
+        <w:t>Skills</w:t>
+      </w:r>
+    </w:p>
+    <w:p>
+      <w:pPr>
+        <w:pStyle w:val="Heading1"/>
+        <w:spacing w:before="202"/>
         <w:rPr>
           <w:b w:val="0"/>
           <w:bCs w:val="0"/>
         </w:rPr>
-        <w:t>o</w:t>
-      </w:r>
+      </w:pPr>
       <w:r>
         <w:rPr>
           <w:b w:val="0"/>
           <w:bCs w:val="0"/>
         </w:rPr>
-        <w:t>utcomes</w:t>
-      </w:r>
-      <w:proofErr w:type="spellEnd"/>
+        <w:t xml:space="preserve">{{ </w:t>
+      </w:r>
       <w:r>
         <w:rPr>
           <w:b w:val="0"/>
           <w:bCs w:val="0"/>
         </w:rPr>
-        <w:t xml:space="preserve"> }</w:t>
-      </w:r>
-      <w:proofErr w:type="gramEnd"/>
+        <w:t xml:space="preserve">demonstrated_skills </w:t>
+      </w:r>
       <w:r>
         <w:rPr>
           <w:b w:val="0"/>
           <w:bCs w:val="0"/>
         </w:rPr>
-        <w:t>}</w:t>
-      </w:r>
-    </w:p>
-    <w:p>
-      <w:pPr>
-        <w:pStyle w:val="Heading1"/>
-        <w:spacing w:before="200"/>
-      </w:pPr>
-      <w:r>
-        <w:t>Demonstrated</w:t>
-      </w:r>
-      <w:r>
-        <w:rPr>
-          <w:spacing w:val="-6"/>
-        </w:rPr>
-        <w:t xml:space="preserve"> </w:t>
-      </w:r>
-      <w:r>
-        <w:rPr>
-          <w:spacing w:val="-2"/>
-        </w:rPr>
-        <w:t>Skills</w:t>
-      </w:r>
-    </w:p>
-    <w:p>
-      <w:pPr>
-        <w:pStyle w:val="Heading1"/>
-        <w:spacing w:before="202"/>
-        <w:rPr>
-          <w:b w:val="0"/>
-          <w:bCs w:val="0"/>
-        </w:rPr>
-      </w:pPr>
-      <w:proofErr w:type="gramStart"/>
-      <w:r>
-        <w:rPr>
-          <w:b w:val="0"/>
-          <w:bCs w:val="0"/>
-        </w:rPr>
-        <w:t xml:space="preserve">{{ </w:t>
-      </w:r>
-      <w:proofErr w:type="spellStart"/>
-      <w:r>
-        <w:rPr>
-          <w:b w:val="0"/>
-          <w:bCs w:val="0"/>
-        </w:rPr>
-        <w:t>demonstrated</w:t>
-      </w:r>
-      <w:proofErr w:type="gramEnd"/>
-      <w:r>
-        <w:rPr>
-          <w:b w:val="0"/>
-          <w:bCs w:val="0"/>
-        </w:rPr>
-        <w:t>_</w:t>
-      </w:r>
-      <w:proofErr w:type="gramStart"/>
-      <w:r>
-        <w:rPr>
-          <w:b w:val="0"/>
-          <w:bCs w:val="0"/>
-        </w:rPr>
-        <w:t>skills</w:t>
-      </w:r>
-      <w:proofErr w:type="spellEnd"/>
-      <w:r>
-        <w:rPr>
-          <w:b w:val="0"/>
-          <w:bCs w:val="0"/>
-        </w:rPr>
-        <w:t xml:space="preserve"> </w:t>
-      </w:r>
-      <w:r>
-        <w:rPr>
-          <w:b w:val="0"/>
-          <w:bCs w:val="0"/>
-        </w:rPr>
-        <w:t>}</w:t>
-      </w:r>
-      <w:proofErr w:type="gramEnd"/>
-      <w:r>
-        <w:rPr>
-          <w:b w:val="0"/>
-          <w:bCs w:val="0"/>
-        </w:rPr>
-        <w:t>}</w:t>
+        <w:t>}}</w:t>
       </w:r>
     </w:p>
     <w:p>
@@ -2802,29 +2680,14 @@
         <w:spacing w:before="201"/>
         <w:ind w:left="720"/>
       </w:pPr>
-      <w:proofErr w:type="gramStart"/>
       <w:r>
         <w:t xml:space="preserve">{{ </w:t>
       </w:r>
-      <w:proofErr w:type="spellStart"/>
-      <w:r>
-        <w:t>knowledge</w:t>
-      </w:r>
-      <w:proofErr w:type="gramEnd"/>
-      <w:r>
-        <w:t>_</w:t>
-      </w:r>
-      <w:proofErr w:type="gramStart"/>
-      <w:r>
-        <w:t>gained</w:t>
-      </w:r>
-      <w:proofErr w:type="spellEnd"/>
-      <w:r>
-        <w:t xml:space="preserve"> }</w:t>
-      </w:r>
-      <w:proofErr w:type="gramEnd"/>
-      <w:r>
-        <w:t>}</w:t>
+      <w:r>
+        <w:t>knowledge_gained</w:t>
+      </w:r>
+      <w:r>
+        <w:t xml:space="preserve"> }}</w:t>
       </w:r>
     </w:p>
     <w:p>
@@ -2854,29 +2717,14 @@
         <w:spacing w:before="201"/>
         <w:ind w:left="720"/>
       </w:pPr>
-      <w:proofErr w:type="gramStart"/>
       <w:r>
         <w:t xml:space="preserve">{{ </w:t>
       </w:r>
-      <w:proofErr w:type="spellStart"/>
-      <w:r>
-        <w:t>compentencies</w:t>
-      </w:r>
-      <w:proofErr w:type="gramEnd"/>
-      <w:r>
-        <w:t>_</w:t>
-      </w:r>
-      <w:proofErr w:type="gramStart"/>
-      <w:r>
-        <w:t>achieved</w:t>
-      </w:r>
-      <w:proofErr w:type="spellEnd"/>
-      <w:r>
-        <w:t xml:space="preserve"> }</w:t>
-      </w:r>
-      <w:proofErr w:type="gramEnd"/>
-      <w:r>
-        <w:t>}</w:t>
+      <w:r>
+        <w:t>compentencies_achieved</w:t>
+      </w:r>
+      <w:r>
+        <w:t xml:space="preserve"> }}</w:t>
       </w:r>
     </w:p>
     <w:p>
@@ -3052,14 +2900,12 @@
                 <w:sz w:val="24"/>
               </w:rPr>
             </w:pPr>
-            <w:proofErr w:type="gramStart"/>
             <w:r>
               <w:t xml:space="preserve">{{ </w:t>
             </w:r>
             <w:r>
               <w:t>attendance</w:t>
             </w:r>
-            <w:proofErr w:type="gramEnd"/>
             <w:r>
               <w:t xml:space="preserve"> }}</w:t>
             </w:r>
@@ -3125,19 +2971,12 @@
                 <w:sz w:val="24"/>
               </w:rPr>
             </w:pPr>
-            <w:proofErr w:type="gramStart"/>
             <w:r>
               <w:t xml:space="preserve">{{ </w:t>
             </w:r>
-            <w:proofErr w:type="spellStart"/>
-            <w:r>
-              <w:t>engagement</w:t>
-            </w:r>
-            <w:proofErr w:type="gramEnd"/>
-            <w:r>
-              <w:t>_level</w:t>
-            </w:r>
-            <w:proofErr w:type="spellEnd"/>
+            <w:r>
+              <w:t>engagement_level</w:t>
+            </w:r>
             <w:r>
               <w:t xml:space="preserve"> }}</w:t>
             </w:r>
@@ -3195,22 +3034,18 @@
                 <w:sz w:val="24"/>
               </w:rPr>
             </w:pPr>
-            <w:proofErr w:type="gramStart"/>
             <w:r>
               <w:t xml:space="preserve">{{ </w:t>
             </w:r>
-            <w:proofErr w:type="spellStart"/>
             <w:r>
               <w:t>participant</w:t>
             </w:r>
-            <w:proofErr w:type="gramEnd"/>
             <w:r>
               <w:t>_</w:t>
             </w:r>
             <w:r>
               <w:t>feedback</w:t>
             </w:r>
-            <w:proofErr w:type="spellEnd"/>
             <w:r>
               <w:t xml:space="preserve"> }}</w:t>
             </w:r>
@@ -3501,19 +3336,12 @@
                 <w:sz w:val="24"/>
               </w:rPr>
             </w:pPr>
-            <w:proofErr w:type="gramStart"/>
             <w:r>
               <w:t xml:space="preserve">{{ </w:t>
             </w:r>
-            <w:proofErr w:type="spellStart"/>
-            <w:r>
-              <w:t>content</w:t>
-            </w:r>
-            <w:proofErr w:type="gramEnd"/>
-            <w:r>
-              <w:t>_quality</w:t>
-            </w:r>
-            <w:proofErr w:type="spellEnd"/>
+            <w:r>
+              <w:t>content_quality</w:t>
+            </w:r>
             <w:r>
               <w:t xml:space="preserve"> }}</w:t>
             </w:r>
@@ -3580,22 +3408,18 @@
                 <w:sz w:val="24"/>
               </w:rPr>
             </w:pPr>
-            <w:proofErr w:type="gramStart"/>
             <w:r>
               <w:t xml:space="preserve">{{ </w:t>
             </w:r>
-            <w:proofErr w:type="spellStart"/>
             <w:r>
               <w:t>trainer</w:t>
             </w:r>
-            <w:proofErr w:type="gramEnd"/>
             <w:r>
               <w:t>_</w:t>
             </w:r>
             <w:r>
               <w:t>effectiveness</w:t>
             </w:r>
-            <w:proofErr w:type="spellEnd"/>
             <w:r>
               <w:t xml:space="preserve"> }}</w:t>
             </w:r>
@@ -3678,19 +3502,12 @@
                 <w:sz w:val="24"/>
               </w:rPr>
             </w:pPr>
-            <w:proofErr w:type="gramStart"/>
             <w:r>
               <w:t xml:space="preserve">{{ </w:t>
             </w:r>
-            <w:proofErr w:type="spellStart"/>
-            <w:r>
-              <w:t>materials</w:t>
-            </w:r>
-            <w:proofErr w:type="gramEnd"/>
-            <w:r>
-              <w:t>_resources</w:t>
-            </w:r>
-            <w:proofErr w:type="spellEnd"/>
+            <w:r>
+              <w:t>materials_resources</w:t>
+            </w:r>
             <w:r>
               <w:t xml:space="preserve"> }}</w:t>
             </w:r>
@@ -3756,22 +3573,18 @@
                 <w:sz w:val="24"/>
               </w:rPr>
             </w:pPr>
-            <w:proofErr w:type="gramStart"/>
             <w:r>
               <w:t xml:space="preserve">{{ </w:t>
             </w:r>
-            <w:proofErr w:type="spellStart"/>
             <w:r>
               <w:t>technical</w:t>
             </w:r>
-            <w:proofErr w:type="gramEnd"/>
             <w:r>
               <w:t>_</w:t>
             </w:r>
             <w:r>
               <w:t>support</w:t>
             </w:r>
-            <w:proofErr w:type="spellEnd"/>
             <w:r>
               <w:t xml:space="preserve"> }}</w:t>
             </w:r>
@@ -3829,19 +3642,12 @@
                 <w:sz w:val="24"/>
               </w:rPr>
             </w:pPr>
-            <w:proofErr w:type="gramStart"/>
             <w:r>
               <w:t xml:space="preserve">{{ </w:t>
             </w:r>
-            <w:proofErr w:type="spellStart"/>
-            <w:r>
-              <w:t>logistical</w:t>
-            </w:r>
-            <w:proofErr w:type="gramEnd"/>
-            <w:r>
-              <w:t>_arrangements</w:t>
-            </w:r>
-            <w:proofErr w:type="spellEnd"/>
+            <w:r>
+              <w:t>logistical_arrangements</w:t>
+            </w:r>
             <w:r>
               <w:t xml:space="preserve"> }}</w:t>
             </w:r>
@@ -3885,7 +3691,6 @@
           <w:sz w:val="24"/>
         </w:rPr>
       </w:pPr>
-      <w:proofErr w:type="gramStart"/>
       <w:r>
         <w:rPr>
           <w:bCs/>
@@ -3902,7 +3707,6 @@
         </w:rPr>
         <w:t>Observations</w:t>
       </w:r>
-      <w:proofErr w:type="gramEnd"/>
       <w:r>
         <w:rPr>
           <w:bCs/>
@@ -4005,37 +3809,12 @@
           <w:spacing w:val="-2"/>
         </w:rPr>
       </w:pPr>
-      <w:proofErr w:type="gramStart"/>
       <w:r>
         <w:rPr>
           <w:i/>
           <w:spacing w:val="-2"/>
         </w:rPr>
-        <w:t>{{ PICTURE</w:t>
-      </w:r>
-      <w:proofErr w:type="gramEnd"/>
-      <w:r>
-        <w:rPr>
-          <w:i/>
-          <w:spacing w:val="-2"/>
-        </w:rPr>
-        <w:t>_</w:t>
-      </w:r>
-      <w:proofErr w:type="gramStart"/>
-      <w:r>
-        <w:rPr>
-          <w:i/>
-          <w:spacing w:val="-2"/>
-        </w:rPr>
-        <w:t>1 }</w:t>
-      </w:r>
-      <w:proofErr w:type="gramEnd"/>
-      <w:r>
-        <w:rPr>
-          <w:i/>
-          <w:spacing w:val="-2"/>
-        </w:rPr>
-        <w:t>}</w:t>
+        <w:t>{{ PICTURE_1 }}</w:t>
       </w:r>
     </w:p>
     <w:p>
@@ -4047,6 +3826,48 @@
           <w:spacing w:val="-2"/>
         </w:rPr>
       </w:pPr>
+      <w:r>
+        <w:rPr>
+          <w:i/>
+          <w:spacing w:val="-2"/>
+        </w:rPr>
+        <w:t xml:space="preserve">Photo 1: </w:t>
+      </w:r>
+      <w:r>
+        <w:rPr>
+          <w:i/>
+          <w:spacing w:val="-2"/>
+        </w:rPr>
+        <w:t xml:space="preserve">{{ </w:t>
+      </w:r>
+      <w:r>
+        <w:rPr>
+          <w:i/>
+          <w:spacing w:val="-2"/>
+        </w:rPr>
+        <w:t>Picture_1</w:t>
+      </w:r>
+      <w:r>
+        <w:rPr>
+          <w:i/>
+          <w:spacing w:val="-2"/>
+        </w:rPr>
+        <w:t>_Description</w:t>
+      </w:r>
+      <w:r>
+        <w:rPr>
+          <w:i/>
+          <w:spacing w:val="-2"/>
+        </w:rPr>
+        <w:t xml:space="preserve"> </w:t>
+      </w:r>
+      <w:r>
+        <w:rPr>
+          <w:i/>
+          <w:spacing w:val="-2"/>
+        </w:rPr>
+        <w:t>}}</w:t>
+      </w:r>
     </w:p>
     <w:p>
       <w:pPr>
@@ -4057,73 +3878,6 @@
           <w:spacing w:val="-2"/>
         </w:rPr>
       </w:pPr>
-      <w:r>
-        <w:rPr>
-          <w:i/>
-          <w:spacing w:val="-2"/>
-        </w:rPr>
-        <w:t xml:space="preserve">Photo 1: </w:t>
-      </w:r>
-      <w:proofErr w:type="gramStart"/>
-      <w:r>
-        <w:rPr>
-          <w:i/>
-          <w:spacing w:val="-2"/>
-        </w:rPr>
-        <w:t xml:space="preserve">{{ </w:t>
-      </w:r>
-      <w:r>
-        <w:rPr>
-          <w:i/>
-          <w:spacing w:val="-2"/>
-        </w:rPr>
-        <w:t>Picture</w:t>
-      </w:r>
-      <w:proofErr w:type="gramEnd"/>
-      <w:r>
-        <w:rPr>
-          <w:i/>
-          <w:spacing w:val="-2"/>
-        </w:rPr>
-        <w:t>_1</w:t>
-      </w:r>
-      <w:r>
-        <w:rPr>
-          <w:i/>
-          <w:spacing w:val="-2"/>
-        </w:rPr>
-        <w:t>_</w:t>
-      </w:r>
-      <w:proofErr w:type="gramStart"/>
-      <w:r>
-        <w:rPr>
-          <w:i/>
-          <w:spacing w:val="-2"/>
-        </w:rPr>
-        <w:t>Description</w:t>
-      </w:r>
-      <w:r>
-        <w:rPr>
-          <w:i/>
-          <w:spacing w:val="-2"/>
-        </w:rPr>
-        <w:t xml:space="preserve"> </w:t>
-      </w:r>
-      <w:r>
-        <w:rPr>
-          <w:i/>
-          <w:spacing w:val="-2"/>
-        </w:rPr>
-        <w:t>}</w:t>
-      </w:r>
-      <w:proofErr w:type="gramEnd"/>
-      <w:r>
-        <w:rPr>
-          <w:i/>
-          <w:spacing w:val="-2"/>
-        </w:rPr>
-        <w:t>}</w:t>
-      </w:r>
     </w:p>
     <w:p>
       <w:pPr>
@@ -4134,6 +3888,45 @@
           <w:spacing w:val="-2"/>
         </w:rPr>
       </w:pPr>
+      <w:proofErr w:type="gramStart"/>
+      <w:r>
+        <w:rPr>
+          <w:i/>
+          <w:spacing w:val="-2"/>
+        </w:rPr>
+        <w:t>{{ PICTURE</w:t>
+      </w:r>
+      <w:proofErr w:type="gramEnd"/>
+      <w:r>
+        <w:rPr>
+          <w:i/>
+          <w:spacing w:val="-2"/>
+        </w:rPr>
+        <w:t>_</w:t>
+      </w:r>
+      <w:proofErr w:type="gramStart"/>
+      <w:r>
+        <w:rPr>
+          <w:i/>
+          <w:spacing w:val="-2"/>
+        </w:rPr>
+        <w:t>2</w:t>
+      </w:r>
+      <w:r>
+        <w:rPr>
+          <w:i/>
+          <w:spacing w:val="-2"/>
+        </w:rPr>
+        <w:t xml:space="preserve"> }</w:t>
+      </w:r>
+      <w:proofErr w:type="gramEnd"/>
+      <w:r>
+        <w:rPr>
+          <w:i/>
+          <w:spacing w:val="-2"/>
+        </w:rPr>
+        <w:t>}</w:t>
+      </w:r>
     </w:p>
     <w:p>
       <w:pPr>
@@ -4144,13 +3937,27 @@
           <w:spacing w:val="-2"/>
         </w:rPr>
       </w:pPr>
+      <w:r>
+        <w:rPr>
+          <w:i/>
+          <w:spacing w:val="-2"/>
+        </w:rPr>
+        <w:t xml:space="preserve">Photo 2: </w:t>
+      </w:r>
       <w:proofErr w:type="gramStart"/>
       <w:r>
         <w:rPr>
           <w:i/>
           <w:spacing w:val="-2"/>
         </w:rPr>
-        <w:t>{{ PICTURE</w:t>
+        <w:t xml:space="preserve">{{ </w:t>
+      </w:r>
+      <w:r>
+        <w:rPr>
+          <w:i/>
+          <w:spacing w:val="-2"/>
+        </w:rPr>
+        <w:t>Picture</w:t>
       </w:r>
       <w:proofErr w:type="gramEnd"/>
       <w:r>
@@ -4160,20 +3967,34 @@
         </w:rPr>
         <w:t>_</w:t>
       </w:r>
+      <w:r>
+        <w:rPr>
+          <w:i/>
+          <w:spacing w:val="-2"/>
+        </w:rPr>
+        <w:t>2_</w:t>
+      </w:r>
       <w:proofErr w:type="gramStart"/>
       <w:r>
         <w:rPr>
           <w:i/>
           <w:spacing w:val="-2"/>
         </w:rPr>
-        <w:t>2</w:t>
+        <w:t>Description</w:t>
       </w:r>
       <w:r>
         <w:rPr>
           <w:i/>
           <w:spacing w:val="-2"/>
         </w:rPr>
-        <w:t xml:space="preserve"> }</w:t>
+        <w:t xml:space="preserve"> </w:t>
+      </w:r>
+      <w:r>
+        <w:rPr>
+          <w:i/>
+          <w:spacing w:val="-2"/>
+        </w:rPr>
+        <w:t>}</w:t>
       </w:r>
       <w:proofErr w:type="gramEnd"/>
       <w:r>
@@ -4203,12 +4024,21 @@
           <w:spacing w:val="-2"/>
         </w:rPr>
       </w:pPr>
+      <w:proofErr w:type="gramStart"/>
       <w:r>
         <w:rPr>
           <w:i/>
           <w:spacing w:val="-2"/>
         </w:rPr>
-        <w:t xml:space="preserve">Photo 2: </w:t>
+        <w:t>{{ PICTURE</w:t>
+      </w:r>
+      <w:proofErr w:type="gramEnd"/>
+      <w:r>
+        <w:rPr>
+          <w:i/>
+          <w:spacing w:val="-2"/>
+        </w:rPr>
+        <w:t>_</w:t>
       </w:r>
       <w:proofErr w:type="gramStart"/>
       <w:r>
@@ -4216,51 +4046,14 @@
           <w:i/>
           <w:spacing w:val="-2"/>
         </w:rPr>
-        <w:t xml:space="preserve">{{ </w:t>
+        <w:t>3</w:t>
       </w:r>
       <w:r>
         <w:rPr>
           <w:i/>
           <w:spacing w:val="-2"/>
         </w:rPr>
-        <w:t>Picture</w:t>
-      </w:r>
-      <w:proofErr w:type="gramEnd"/>
-      <w:r>
-        <w:rPr>
-          <w:i/>
-          <w:spacing w:val="-2"/>
-        </w:rPr>
-        <w:t>_</w:t>
-      </w:r>
-      <w:r>
-        <w:rPr>
-          <w:i/>
-          <w:spacing w:val="-2"/>
-        </w:rPr>
-        <w:t>2_</w:t>
-      </w:r>
-      <w:proofErr w:type="gramStart"/>
-      <w:r>
-        <w:rPr>
-          <w:i/>
-          <w:spacing w:val="-2"/>
-        </w:rPr>
-        <w:t>Description</w:t>
-      </w:r>
-      <w:r>
-        <w:rPr>
-          <w:i/>
-          <w:spacing w:val="-2"/>
-        </w:rPr>
-        <w:t xml:space="preserve"> </w:t>
-      </w:r>
-      <w:r>
-        <w:rPr>
-          <w:i/>
-          <w:spacing w:val="-2"/>
-        </w:rPr>
-        <w:t>}</w:t>
+        <w:t xml:space="preserve"> }</w:t>
       </w:r>
       <w:proofErr w:type="gramEnd"/>
       <w:r>
@@ -4280,6 +4073,73 @@
           <w:spacing w:val="-2"/>
         </w:rPr>
       </w:pPr>
+      <w:r>
+        <w:rPr>
+          <w:i/>
+          <w:spacing w:val="-2"/>
+        </w:rPr>
+        <w:t xml:space="preserve">Photo 3: </w:t>
+      </w:r>
+      <w:proofErr w:type="gramStart"/>
+      <w:r>
+        <w:rPr>
+          <w:i/>
+          <w:spacing w:val="-2"/>
+        </w:rPr>
+        <w:t xml:space="preserve">{{ </w:t>
+      </w:r>
+      <w:r>
+        <w:rPr>
+          <w:i/>
+          <w:spacing w:val="-2"/>
+        </w:rPr>
+        <w:t>Picture</w:t>
+      </w:r>
+      <w:proofErr w:type="gramEnd"/>
+      <w:r>
+        <w:rPr>
+          <w:i/>
+          <w:spacing w:val="-2"/>
+        </w:rPr>
+        <w:t>_</w:t>
+      </w:r>
+      <w:r>
+        <w:rPr>
+          <w:i/>
+          <w:spacing w:val="-2"/>
+        </w:rPr>
+        <w:t>3_</w:t>
+      </w:r>
+      <w:proofErr w:type="gramStart"/>
+      <w:r>
+        <w:rPr>
+          <w:i/>
+          <w:spacing w:val="-2"/>
+        </w:rPr>
+        <w:t>Description</w:t>
+      </w:r>
+      <w:r>
+        <w:rPr>
+          <w:i/>
+          <w:spacing w:val="-2"/>
+        </w:rPr>
+        <w:t xml:space="preserve"> </w:t>
+      </w:r>
+      <w:r>
+        <w:rPr>
+          <w:i/>
+          <w:spacing w:val="-2"/>
+        </w:rPr>
+        <w:t>}</w:t>
+      </w:r>
+      <w:proofErr w:type="gramEnd"/>
+      <w:r>
+        <w:rPr>
+          <w:i/>
+          <w:spacing w:val="-2"/>
+        </w:rPr>
+        <w:t>}</w:t>
+      </w:r>
     </w:p>
     <w:p>
       <w:pPr>
@@ -4290,45 +4150,6 @@
           <w:spacing w:val="-2"/>
         </w:rPr>
       </w:pPr>
-      <w:proofErr w:type="gramStart"/>
-      <w:r>
-        <w:rPr>
-          <w:i/>
-          <w:spacing w:val="-2"/>
-        </w:rPr>
-        <w:t>{{ PICTURE</w:t>
-      </w:r>
-      <w:proofErr w:type="gramEnd"/>
-      <w:r>
-        <w:rPr>
-          <w:i/>
-          <w:spacing w:val="-2"/>
-        </w:rPr>
-        <w:t>_</w:t>
-      </w:r>
-      <w:proofErr w:type="gramStart"/>
-      <w:r>
-        <w:rPr>
-          <w:i/>
-          <w:spacing w:val="-2"/>
-        </w:rPr>
-        <w:t>3</w:t>
-      </w:r>
-      <w:r>
-        <w:rPr>
-          <w:i/>
-          <w:spacing w:val="-2"/>
-        </w:rPr>
-        <w:t xml:space="preserve"> }</w:t>
-      </w:r>
-      <w:proofErr w:type="gramEnd"/>
-      <w:r>
-        <w:rPr>
-          <w:i/>
-          <w:spacing w:val="-2"/>
-        </w:rPr>
-        <w:t>}</w:t>
-      </w:r>
     </w:p>
     <w:p>
       <w:pPr>
@@ -4339,6 +4160,45 @@
           <w:spacing w:val="-2"/>
         </w:rPr>
       </w:pPr>
+      <w:proofErr w:type="gramStart"/>
+      <w:r>
+        <w:rPr>
+          <w:i/>
+          <w:spacing w:val="-2"/>
+        </w:rPr>
+        <w:t>{{ PICTURE</w:t>
+      </w:r>
+      <w:proofErr w:type="gramEnd"/>
+      <w:r>
+        <w:rPr>
+          <w:i/>
+          <w:spacing w:val="-2"/>
+        </w:rPr>
+        <w:t>_</w:t>
+      </w:r>
+      <w:proofErr w:type="gramStart"/>
+      <w:r>
+        <w:rPr>
+          <w:i/>
+          <w:spacing w:val="-2"/>
+        </w:rPr>
+        <w:t>4</w:t>
+      </w:r>
+      <w:r>
+        <w:rPr>
+          <w:i/>
+          <w:spacing w:val="-2"/>
+        </w:rPr>
+        <w:t xml:space="preserve"> }</w:t>
+      </w:r>
+      <w:proofErr w:type="gramEnd"/>
+      <w:r>
+        <w:rPr>
+          <w:i/>
+          <w:spacing w:val="-2"/>
+        </w:rPr>
+        <w:t>}</w:t>
+      </w:r>
     </w:p>
     <w:p>
       <w:pPr>
@@ -4354,7 +4214,7 @@
           <w:i/>
           <w:spacing w:val="-2"/>
         </w:rPr>
-        <w:t xml:space="preserve">Photo 3: </w:t>
+        <w:t xml:space="preserve">Photo 4: </w:t>
       </w:r>
       <w:proofErr w:type="gramStart"/>
       <w:r>
@@ -4384,7 +4244,7 @@
           <w:i/>
           <w:spacing w:val="-2"/>
         </w:rPr>
-        <w:t>3_</w:t>
+        <w:t>4_</w:t>
       </w:r>
       <w:proofErr w:type="gramStart"/>
       <w:r>
@@ -4458,7 +4318,7 @@
           <w:i/>
           <w:spacing w:val="-2"/>
         </w:rPr>
-        <w:t>4</w:t>
+        <w:t>5</w:t>
       </w:r>
       <w:r>
         <w:rPr>
@@ -4475,162 +4335,6 @@
         </w:rPr>
         <w:t>}</w:t>
       </w:r>
-    </w:p>
-    <w:p>
-      <w:pPr>
-        <w:spacing w:before="187"/>
-        <w:ind w:left="720"/>
-        <w:rPr>
-          <w:i/>
-          <w:spacing w:val="-2"/>
-        </w:rPr>
-      </w:pPr>
-    </w:p>
-    <w:p>
-      <w:pPr>
-        <w:spacing w:before="187"/>
-        <w:ind w:left="720"/>
-        <w:rPr>
-          <w:i/>
-          <w:spacing w:val="-2"/>
-        </w:rPr>
-      </w:pPr>
-      <w:r>
-        <w:rPr>
-          <w:i/>
-          <w:spacing w:val="-2"/>
-        </w:rPr>
-        <w:t xml:space="preserve">Photo 4: </w:t>
-      </w:r>
-      <w:proofErr w:type="gramStart"/>
-      <w:r>
-        <w:rPr>
-          <w:i/>
-          <w:spacing w:val="-2"/>
-        </w:rPr>
-        <w:t xml:space="preserve">{{ </w:t>
-      </w:r>
-      <w:r>
-        <w:rPr>
-          <w:i/>
-          <w:spacing w:val="-2"/>
-        </w:rPr>
-        <w:t>Picture</w:t>
-      </w:r>
-      <w:proofErr w:type="gramEnd"/>
-      <w:r>
-        <w:rPr>
-          <w:i/>
-          <w:spacing w:val="-2"/>
-        </w:rPr>
-        <w:t>_</w:t>
-      </w:r>
-      <w:r>
-        <w:rPr>
-          <w:i/>
-          <w:spacing w:val="-2"/>
-        </w:rPr>
-        <w:t>4_</w:t>
-      </w:r>
-      <w:proofErr w:type="gramStart"/>
-      <w:r>
-        <w:rPr>
-          <w:i/>
-          <w:spacing w:val="-2"/>
-        </w:rPr>
-        <w:t>Description</w:t>
-      </w:r>
-      <w:r>
-        <w:rPr>
-          <w:i/>
-          <w:spacing w:val="-2"/>
-        </w:rPr>
-        <w:t xml:space="preserve"> </w:t>
-      </w:r>
-      <w:r>
-        <w:rPr>
-          <w:i/>
-          <w:spacing w:val="-2"/>
-        </w:rPr>
-        <w:t>}</w:t>
-      </w:r>
-      <w:proofErr w:type="gramEnd"/>
-      <w:r>
-        <w:rPr>
-          <w:i/>
-          <w:spacing w:val="-2"/>
-        </w:rPr>
-        <w:t>}</w:t>
-      </w:r>
-    </w:p>
-    <w:p>
-      <w:pPr>
-        <w:spacing w:before="187"/>
-        <w:ind w:left="720"/>
-        <w:rPr>
-          <w:i/>
-          <w:spacing w:val="-2"/>
-        </w:rPr>
-      </w:pPr>
-    </w:p>
-    <w:p>
-      <w:pPr>
-        <w:spacing w:before="187"/>
-        <w:ind w:left="720"/>
-        <w:rPr>
-          <w:i/>
-          <w:spacing w:val="-2"/>
-        </w:rPr>
-      </w:pPr>
-      <w:proofErr w:type="gramStart"/>
-      <w:r>
-        <w:rPr>
-          <w:i/>
-          <w:spacing w:val="-2"/>
-        </w:rPr>
-        <w:t>{{ PICTURE</w:t>
-      </w:r>
-      <w:proofErr w:type="gramEnd"/>
-      <w:r>
-        <w:rPr>
-          <w:i/>
-          <w:spacing w:val="-2"/>
-        </w:rPr>
-        <w:t>_</w:t>
-      </w:r>
-      <w:proofErr w:type="gramStart"/>
-      <w:r>
-        <w:rPr>
-          <w:i/>
-          <w:spacing w:val="-2"/>
-        </w:rPr>
-        <w:t>5</w:t>
-      </w:r>
-      <w:r>
-        <w:rPr>
-          <w:i/>
-          <w:spacing w:val="-2"/>
-        </w:rPr>
-        <w:t xml:space="preserve"> }</w:t>
-      </w:r>
-      <w:proofErr w:type="gramEnd"/>
-      <w:r>
-        <w:rPr>
-          <w:i/>
-          <w:spacing w:val="-2"/>
-        </w:rPr>
-        <w:t>}</w:t>
-      </w:r>
-    </w:p>
-    <w:p>
-      <w:pPr>
-        <w:spacing w:before="187"/>
-        <w:ind w:left="720"/>
-        <w:rPr>
-          <w:i/>
-          <w:spacing w:val="-2"/>
-        </w:rPr>
-      </w:pPr>
     </w:p>
     <w:p>
       <w:pPr>
@@ -4789,7 +4493,7 @@
     </w:p>
     <w:tbl>
       <w:tblPr>
-        <w:tblW w:w="0" w:type="auto"/>
+        <w:tblW w:w="10814" w:type="dxa"/>
         <w:tblInd w:w="91" w:type="dxa"/>
         <w:tblBorders>
           <w:top w:val="single" w:sz="8" w:space="0" w:color="000000"/>
@@ -4808,10 +4512,10 @@
       </w:tblPr>
       <w:tblGrid>
         <w:gridCol w:w="1884"/>
-        <w:gridCol w:w="2373"/>
-        <w:gridCol w:w="2588"/>
-        <w:gridCol w:w="1985"/>
-        <w:gridCol w:w="1807"/>
+        <w:gridCol w:w="2551"/>
+        <w:gridCol w:w="2694"/>
+        <w:gridCol w:w="1984"/>
+        <w:gridCol w:w="1701"/>
       </w:tblGrid>
       <w:tr>
         <w:trPr>
@@ -4841,7 +4545,7 @@
         </w:tc>
         <w:tc>
           <w:tcPr>
-            <w:tcW w:w="2373" w:type="dxa"/>
+            <w:tcW w:w="2551" w:type="dxa"/>
           </w:tcPr>
           <w:p>
             <w:pPr>
@@ -4862,7 +4566,7 @@
         </w:tc>
         <w:tc>
           <w:tcPr>
-            <w:tcW w:w="2588" w:type="dxa"/>
+            <w:tcW w:w="2694" w:type="dxa"/>
           </w:tcPr>
           <w:p>
             <w:pPr>
@@ -4884,7 +4588,7 @@
         </w:tc>
         <w:tc>
           <w:tcPr>
-            <w:tcW w:w="1985" w:type="dxa"/>
+            <w:tcW w:w="1984" w:type="dxa"/>
           </w:tcPr>
           <w:p>
             <w:pPr>
@@ -4906,7 +4610,7 @@
         </w:tc>
         <w:tc>
           <w:tcPr>
-            <w:tcW w:w="1807" w:type="dxa"/>
+            <w:tcW w:w="1701" w:type="dxa"/>
           </w:tcPr>
           <w:p>
             <w:pPr>
@@ -4968,7 +4672,7 @@
         </w:tc>
         <w:tc>
           <w:tcPr>
-            <w:tcW w:w="2373" w:type="dxa"/>
+            <w:tcW w:w="2551" w:type="dxa"/>
           </w:tcPr>
           <w:p>
             <w:pPr>
@@ -5015,7 +4719,7 @@
         </w:tc>
         <w:tc>
           <w:tcPr>
-            <w:tcW w:w="2588" w:type="dxa"/>
+            <w:tcW w:w="2694" w:type="dxa"/>
           </w:tcPr>
           <w:p>
             <w:pPr>
@@ -5062,7 +4766,7 @@
         </w:tc>
         <w:tc>
           <w:tcPr>
-            <w:tcW w:w="1985" w:type="dxa"/>
+            <w:tcW w:w="1984" w:type="dxa"/>
           </w:tcPr>
           <w:p>
             <w:pPr>
@@ -5109,7 +4813,7 @@
         </w:tc>
         <w:tc>
           <w:tcPr>
-            <w:tcW w:w="1807" w:type="dxa"/>
+            <w:tcW w:w="1701" w:type="dxa"/>
           </w:tcPr>
           <w:p>
             <w:pPr>
@@ -5183,7 +4887,7 @@
         </w:tc>
         <w:tc>
           <w:tcPr>
-            <w:tcW w:w="2373" w:type="dxa"/>
+            <w:tcW w:w="2551" w:type="dxa"/>
           </w:tcPr>
           <w:p>
             <w:pPr>
@@ -5232,7 +4936,7 @@
         </w:tc>
         <w:tc>
           <w:tcPr>
-            <w:tcW w:w="2588" w:type="dxa"/>
+            <w:tcW w:w="2694" w:type="dxa"/>
           </w:tcPr>
           <w:p>
             <w:pPr>
@@ -5279,7 +4983,7 @@
         </w:tc>
         <w:tc>
           <w:tcPr>
-            <w:tcW w:w="1985" w:type="dxa"/>
+            <w:tcW w:w="1984" w:type="dxa"/>
           </w:tcPr>
           <w:p>
             <w:pPr>
@@ -5328,7 +5032,7 @@
         </w:tc>
         <w:tc>
           <w:tcPr>
-            <w:tcW w:w="1807" w:type="dxa"/>
+            <w:tcW w:w="1701" w:type="dxa"/>
           </w:tcPr>
           <w:p>
             <w:pPr>
@@ -5409,7 +5113,7 @@
         </w:tc>
         <w:tc>
           <w:tcPr>
-            <w:tcW w:w="2373" w:type="dxa"/>
+            <w:tcW w:w="2551" w:type="dxa"/>
           </w:tcPr>
           <w:p>
             <w:pPr>
@@ -5470,7 +5174,7 @@
         </w:tc>
         <w:tc>
           <w:tcPr>
-            <w:tcW w:w="2588" w:type="dxa"/>
+            <w:tcW w:w="2694" w:type="dxa"/>
           </w:tcPr>
           <w:p>
             <w:pPr>
@@ -5517,7 +5221,7 @@
         </w:tc>
         <w:tc>
           <w:tcPr>
-            <w:tcW w:w="1985" w:type="dxa"/>
+            <w:tcW w:w="1984" w:type="dxa"/>
           </w:tcPr>
           <w:p>
             <w:pPr>
@@ -5564,7 +5268,7 @@
         </w:tc>
         <w:tc>
           <w:tcPr>
-            <w:tcW w:w="1807" w:type="dxa"/>
+            <w:tcW w:w="1701" w:type="dxa"/>
           </w:tcPr>
           <w:p>
             <w:pPr>
@@ -5638,7 +5342,7 @@
         </w:tc>
         <w:tc>
           <w:tcPr>
-            <w:tcW w:w="2373" w:type="dxa"/>
+            <w:tcW w:w="2551" w:type="dxa"/>
           </w:tcPr>
           <w:p>
             <w:pPr>
@@ -5697,7 +5401,7 @@
         </w:tc>
         <w:tc>
           <w:tcPr>
-            <w:tcW w:w="2588" w:type="dxa"/>
+            <w:tcW w:w="2694" w:type="dxa"/>
           </w:tcPr>
           <w:p>
             <w:pPr>
@@ -5744,7 +5448,7 @@
         </w:tc>
         <w:tc>
           <w:tcPr>
-            <w:tcW w:w="1985" w:type="dxa"/>
+            <w:tcW w:w="1984" w:type="dxa"/>
           </w:tcPr>
           <w:p>
             <w:pPr>
@@ -5791,7 +5495,7 @@
         </w:tc>
         <w:tc>
           <w:tcPr>
-            <w:tcW w:w="1807" w:type="dxa"/>
+            <w:tcW w:w="1701" w:type="dxa"/>
           </w:tcPr>
           <w:p>
             <w:pPr>
@@ -5864,7 +5568,7 @@
         </w:tc>
         <w:tc>
           <w:tcPr>
-            <w:tcW w:w="2373" w:type="dxa"/>
+            <w:tcW w:w="2551" w:type="dxa"/>
           </w:tcPr>
           <w:p>
             <w:pPr>
@@ -5911,7 +5615,7 @@
         </w:tc>
         <w:tc>
           <w:tcPr>
-            <w:tcW w:w="2588" w:type="dxa"/>
+            <w:tcW w:w="2694" w:type="dxa"/>
           </w:tcPr>
           <w:p>
             <w:pPr>
@@ -5958,7 +5662,7 @@
         </w:tc>
         <w:tc>
           <w:tcPr>
-            <w:tcW w:w="1985" w:type="dxa"/>
+            <w:tcW w:w="1984" w:type="dxa"/>
           </w:tcPr>
           <w:p>
             <w:pPr>
@@ -6005,7 +5709,7 @@
         </w:tc>
         <w:tc>
           <w:tcPr>
-            <w:tcW w:w="1807" w:type="dxa"/>
+            <w:tcW w:w="1701" w:type="dxa"/>
           </w:tcPr>
           <w:p>
             <w:pPr>
@@ -6224,7 +5928,7 @@
                     <pic:cNvPicPr/>
                   </pic:nvPicPr>
                   <pic:blipFill>
-                    <a:blip r:embed="rId9" cstate="print"/>
+                    <a:blip r:embed="rId10" cstate="print"/>
                     <a:stretch>
                       <a:fillRect/>
                     </a:stretch>
@@ -9743,6 +9447,7 @@
   <w:style w:type="character" w:default="1" w:styleId="DefaultParagraphFont">
     <w:name w:val="Default Paragraph Font"/>
     <w:uiPriority w:val="1"/>
+    <w:semiHidden/>
     <w:unhideWhenUsed/>
   </w:style>
   <w:style w:type="table" w:default="1" w:styleId="TableNormal">
@@ -10095,4 +9800,16 @@
   <a:objectDefaults/>
   <a:extraClrSchemeLst/>
 </a:theme>
+</file>
+
+<file path=customXml/item1.xml><?xml version="1.0" encoding="utf-8"?>
+<b:Sources xmlns:b="http://schemas.openxmlformats.org/officeDocument/2006/bibliography" xmlns="http://schemas.openxmlformats.org/officeDocument/2006/bibliography" SelectedStyle="\APASixthEditionOfficeOnline.xsl" StyleName="APA" Version="6"/>
+</file>
+
+<file path=customXml/itemProps1.xml><?xml version="1.0" encoding="utf-8"?>
+<ds:datastoreItem xmlns:ds="http://schemas.openxmlformats.org/officeDocument/2006/customXml" ds:itemID="{B424D0A8-9643-411C-835D-DB8CBB472AF7}">
+  <ds:schemaRefs>
+    <ds:schemaRef ds:uri="http://schemas.openxmlformats.org/officeDocument/2006/bibliography"/>
+  </ds:schemaRefs>
+</ds:datastoreItem>
 </file>
</xml_diff>